<commit_message>
revisa os materiais da sprint 2 e registra testes e servicos externos
</commit_message>
<xml_diff>
--- a/docs/evolucao/ERS-v2.docx
+++ b/docs/evolucao/ERS-v2.docx
@@ -12,7 +12,7 @@
           <w:b w:val="false"/>
           <w:bCs w:val="false"/>
         </w:rPr>
-        <w:t xml:space="preserve">ERS v2.0 — LinkAtletas — ampliação da Sprint 2</w:t>
+        <w:t xml:space="preserve">ERS v2.1 — LinkAtletas — ampliação da Sprint 2</w:t>
       </w:r>
     </w:p>
     <w:p>
@@ -30,7 +30,7 @@
           <w:b w:val="false"/>
           <w:bCs w:val="false"/>
         </w:rPr>
-        <w:t xml:space="preserve">Data: 14/10/2026. Responsável pelo incremento: Lucca, com autoria Git </w:t>
+        <w:t xml:space="preserve">Data da revisão: 20/10/2026. Responsável pelo incremento: Lucca, com autoria Git </w:t>
       </w:r>
       <w:r>
         <w:rPr>
@@ -365,6 +365,76 @@
                 <w:szCs w:val="20"/>
               </w:rPr>
               <w:t xml:space="preserve">Ampliação aprovada (../superpowers/specs/2026-10-14-expansao-completa-design.md): comunicação, mídia, privacidade, recuperação, ciclos, financeiro e cliente nativo</w:t>
+            </w:r>
+          </w:p>
+        </w:tc>
+      </w:tr>
+      <w:tr>
+        <w:trPr>
+          <w:cantSplit/>
+          <w:tblHeader w:val="off"/>
+        </w:trPr>
+        <w:tc>
+          <w:tcPr>
+            <w:tcW w:type="dxa" w:w="4819"/>
+            <w:tcBorders>
+              <w:top w:val="single" w:color="D2DCD6" w:sz="1"/>
+              <w:left w:val="single" w:color="D2DCD6" w:sz="1"/>
+              <w:bottom w:val="single" w:color="D2DCD6" w:sz="1"/>
+              <w:right w:val="single" w:color="D2DCD6" w:sz="1"/>
+            </w:tcBorders>
+            <w:shd w:fill="FFFFFF" w:val="clear"/>
+            <w:tcMar>
+              <w:top w:type="dxa" w:w="80"/>
+              <w:left w:type="dxa" w:w="100"/>
+              <w:bottom w:type="dxa" w:w="80"/>
+              <w:right w:type="dxa" w:w="100"/>
+            </w:tcMar>
+          </w:tcPr>
+          <w:p>
+            <w:pPr>
+              <w:spacing w:after="40"/>
+            </w:pPr>
+            <w:r>
+              <w:rPr>
+                <w:b w:val="false"/>
+                <w:bCs w:val="false"/>
+                <w:sz w:val="20"/>
+                <w:szCs w:val="20"/>
+              </w:rPr>
+              <w:t xml:space="preserve">2.1</w:t>
+            </w:r>
+          </w:p>
+        </w:tc>
+        <w:tc>
+          <w:tcPr>
+            <w:tcW w:type="dxa" w:w="4819"/>
+            <w:tcBorders>
+              <w:top w:val="single" w:color="D2DCD6" w:sz="1"/>
+              <w:left w:val="single" w:color="D2DCD6" w:sz="1"/>
+              <w:bottom w:val="single" w:color="D2DCD6" w:sz="1"/>
+              <w:right w:val="single" w:color="D2DCD6" w:sz="1"/>
+            </w:tcBorders>
+            <w:shd w:fill="FFFFFF" w:val="clear"/>
+            <w:tcMar>
+              <w:top w:type="dxa" w:w="80"/>
+              <w:left w:type="dxa" w:w="100"/>
+              <w:bottom w:type="dxa" w:w="80"/>
+              <w:right w:type="dxa" w:w="100"/>
+            </w:tcMar>
+          </w:tcPr>
+          <w:p>
+            <w:pPr>
+              <w:spacing w:after="40"/>
+            </w:pPr>
+            <w:r>
+              <w:rPr>
+                <w:b w:val="false"/>
+                <w:bCs w:val="false"/>
+                <w:sz w:val="20"/>
+                <w:szCs w:val="20"/>
+              </w:rPr>
+              <w:t xml:space="preserve">Revisão dos materiais originais, DER conferido contra 36 tabelas/257 colunas/45 FKs, perfil Android local e correções de privacidade/backup; revisão e divergências (revisao-materiais.md)</w:t>
             </w:r>
           </w:p>
         </w:tc>
@@ -9233,6 +9303,125 @@
         <w:spacing w:after="50"/>
       </w:pPr>
     </w:p>
+    <w:p>
+      <w:pPr>
+        <w:pStyle w:val="Heading1"/>
+        <w:keepNext/>
+      </w:pPr>
+      <w:r>
+        <w:rPr>
+          <w:b w:val="false"/>
+          <w:bCs w:val="false"/>
+        </w:rPr>
+        <w:t xml:space="preserve">Revisão de escopo e execução de 15–20/10/2026</w:t>
+      </w:r>
+    </w:p>
+    <w:p>
+      <w:pPr>
+        <w:spacing w:after="50"/>
+      </w:pPr>
+    </w:p>
+    <w:p>
+      <w:pPr>
+        <w:widowControl/>
+        <w:spacing w:after="100" w:line="260"/>
+      </w:pPr>
+      <w:r>
+        <w:rPr>
+          <w:b w:val="false"/>
+          <w:bCs w:val="false"/>
+        </w:rPr>
+        <w:t xml:space="preserve">O roteiro docente define a Sprint 2 entre 21/09 e 26/10/2026. A ERS original previa CREF automático nesta Sprint; a proposta também solicita evolução de IA. A contingência manual auditada e o match por regras são decisões implementadas e aprovadas por Lucca, mas exigem alinhamento docente para substituir esses compromissos originais. PostgreSQL substitui a menção a dois SGBDs; nuvem, iOS/lojas e autosave contínuo têm limites descritos na </w:t>
+      </w:r>
+      <w:r>
+        <w:rPr>
+          <w:b w:val="false"/>
+          <w:bCs w:val="false"/>
+        </w:rPr>
+        <w:t xml:space="preserve">revisão dos materiais (revisao-materiais.md)</w:t>
+      </w:r>
+      <w:r>
+        <w:rPr>
+          <w:b w:val="false"/>
+          <w:bCs w:val="false"/>
+        </w:rPr>
+        <w:t xml:space="preserve">. Os nove artefatos não comprovam aceitação integral de cada requisito original.</w:t>
+      </w:r>
+    </w:p>
+    <w:p>
+      <w:pPr>
+        <w:spacing w:after="50"/>
+      </w:pPr>
+    </w:p>
+    <w:p>
+      <w:pPr>
+        <w:widowControl/>
+        <w:spacing w:after="100" w:line="260"/>
+      </w:pPr>
+      <w:r>
+        <w:rPr>
+          <w:b w:val="false"/>
+          <w:bCs w:val="false"/>
+        </w:rPr>
+        <w:t xml:space="preserve">O APK de demonstração tem pacote separado e aceita HTTP somente em loopback/endereço do emulador; o perfil normal continua exigindo HTTPS. O túnel USB permite testar o backend local sem publicá-lo. </w:t>
+      </w:r>
+      <w:r>
+        <w:rPr>
+          <w:b w:val="false"/>
+          <w:bCs w:val="false"/>
+        </w:rPr>
+        <w:t xml:space="preserve">Manual Android (manual-apk-local.md)</w:t>
+      </w:r>
+      <w:r>
+        <w:rPr>
+          <w:b w:val="false"/>
+          <w:bCs w:val="false"/>
+        </w:rPr>
+        <w:t xml:space="preserve">, </w:t>
+      </w:r>
+      <w:r>
+        <w:rPr>
+          <w:b w:val="false"/>
+          <w:bCs w:val="false"/>
+        </w:rPr>
+        <w:t xml:space="preserve">dependências externas (servicos-externos-sprint-2.md)</w:t>
+      </w:r>
+      <w:r>
+        <w:rPr>
+          <w:b w:val="false"/>
+          <w:bCs w:val="false"/>
+        </w:rPr>
+        <w:t xml:space="preserve"> e </w:t>
+      </w:r>
+      <w:r>
+        <w:rPr>
+          <w:b w:val="false"/>
+          <w:bCs w:val="false"/>
+        </w:rPr>
+        <w:t xml:space="preserve">auditoria de bibliotecas (seguranca-dependencias.md)</w:t>
+      </w:r>
+      <w:r>
+        <w:rPr>
+          <w:b w:val="false"/>
+          <w:bCs w:val="false"/>
+        </w:rPr>
+        <w:t xml:space="preserve"> registram estados e restrições. A API e os modelos foram confrontados com OpenAPI e metadados reais do banco, sem exportar dados pessoais: </w:t>
+      </w:r>
+      <w:r>
+        <w:rPr>
+          <w:b w:val="false"/>
+          <w:bCs w:val="false"/>
+        </w:rPr>
+        <w:t xml:space="preserve">dicionário completo (dicionario-dados.md)</w:t>
+      </w:r>
+      <w:r>
+        <w:rPr>
+          <w:b w:val="false"/>
+          <w:bCs w:val="false"/>
+        </w:rPr>
+        <w:t xml:space="preserve">.</w:t>
+      </w:r>
+    </w:p>
     <w:sectPr>
       <w:footerReference w:type="default" r:id="rId6"/>
       <w:pgSz w:w="11906" w:h="16838" w:orient="portrait"/>
@@ -9293,7 +9482,7 @@
         <w:sz w:val="17"/>
         <w:szCs w:val="17"/>
       </w:rPr>
-      <w:t xml:space="preserve">LinkAtletas · 14/10/2026     </w:t>
+      <w:t xml:space="preserve">LinkAtletas · 20/10/2026     </w:t>
     </w:r>
     <w:r>
       <w:rPr>

</xml_diff>

<commit_message>
consolida a revisao da sprint 2 com o apk testado e as evidencias finais
</commit_message>
<xml_diff>
--- a/docs/evolucao/ERS-v2.docx
+++ b/docs/evolucao/ERS-v2.docx
@@ -30,7 +30,7 @@
           <w:b w:val="false"/>
           <w:bCs w:val="false"/>
         </w:rPr>
-        <w:t xml:space="preserve">Data da revisão: 20/10/2026. Responsável pelo incremento: Lucca, com autoria Git </w:t>
+        <w:t xml:space="preserve">Data da revisão: 21/10/2026. Responsável pelo incremento: Lucca, com autoria Git </w:t>
       </w:r>
       <w:r>
         <w:rPr>
@@ -7093,7 +7093,7 @@
                 <w:sz w:val="20"/>
                 <w:szCs w:val="20"/>
               </w:rPr>
-              <w:t xml:space="preserve">APK Android compilado na CI; fluxo completo em aparelhos e distribuição pendentes. IPA requer Xcode/serviço e credenciais</w:t>
+              <w:t xml:space="preserve">APK local compilado e 18 etapas integradas aprovadas no emulador Android API 35; aparelho físico, distribuição e IPA pendentes</w:t>
             </w:r>
           </w:p>
         </w:tc>
@@ -9313,7 +9313,7 @@
           <w:b w:val="false"/>
           <w:bCs w:val="false"/>
         </w:rPr>
-        <w:t xml:space="preserve">Revisão de escopo e execução de 15–20/10/2026</w:t>
+        <w:t xml:space="preserve">Revisão de escopo e execução de 15–21/10/2026</w:t>
       </w:r>
     </w:p>
     <w:p>
@@ -9482,7 +9482,7 @@
         <w:sz w:val="17"/>
         <w:szCs w:val="17"/>
       </w:rPr>
-      <w:t xml:space="preserve">LinkAtletas · 20/10/2026     </w:t>
+      <w:t xml:space="preserve">LinkAtletas · 21/10/2026     </w:t>
     </w:r>
     <w:r>
       <w:rPr>

</xml_diff>

<commit_message>
atualiza a ers e registra o aceite do cref manual
</commit_message>
<xml_diff>
--- a/docs/evolucao/ERS-v2.docx
+++ b/docs/evolucao/ERS-v2.docx
@@ -12,7 +12,7 @@
           <w:b w:val="false"/>
           <w:bCs w:val="false"/>
         </w:rPr>
-        <w:t xml:space="preserve">ERS v2.1 — LinkAtletas — ampliação da Sprint 2</w:t>
+        <w:t xml:space="preserve">ERS v2.2 — LinkAtletas — ampliação da Sprint 2</w:t>
       </w:r>
     </w:p>
     <w:p>
@@ -30,7 +30,7 @@
           <w:b w:val="false"/>
           <w:bCs w:val="false"/>
         </w:rPr>
-        <w:t xml:space="preserve">Data da revisão: 21/10/2026. Responsável pelo incremento: Lucca, com autoria Git </w:t>
+        <w:t xml:space="preserve">Data da revisão: 23/10/2026. Responsável pela revisão: Lucca Castilho Costa, com autoria Git </w:t>
       </w:r>
       <w:r>
         <w:rPr>
@@ -47,7 +47,7 @@
           <w:b w:val="false"/>
           <w:bCs w:val="false"/>
         </w:rPr>
-        <w:t xml:space="preserve">. Demanda SAGA nº 12871, Ivi-it; Projeto Integrador Interdisciplinar II, ADS/SENAI Félix Guisard. Prazo informado para a Sprint 2: 26/10/2026. A aprovação técnica de Lucca não representa aprovação docente ou submissão acadêmica.</w:t>
+        <w:t xml:space="preserve">. Demanda SAGA nº 12871, Ivi-it; Projeto Integrador Interdisciplinar II, ADS/SENAI Félix Guisard. Prazo informado para a Sprint 2: 26/10/2026. O aceite docente da conferência manual de CREF foi informado pela equipe nesta revisão; não se estende automaticamente a outros ajustes de escopo nem comprova submissão acadêmica.</w:t>
       </w:r>
     </w:p>
     <w:p>
@@ -86,8 +86,10 @@
         </w:tblBorders>
       </w:tblPr>
       <w:tblGrid>
-        <w:gridCol w:w="4819"/>
-        <w:gridCol w:w="4819"/>
+        <w:gridCol w:w="1300"/>
+        <w:gridCol w:w="700"/>
+        <w:gridCol w:w="5700"/>
+        <w:gridCol w:w="1938"/>
       </w:tblGrid>
       <w:tr>
         <w:trPr>
@@ -96,7 +98,7 @@
         </w:trPr>
         <w:tc>
           <w:tcPr>
-            <w:tcW w:type="dxa" w:w="4819"/>
+            <w:tcW w:type="dxa" w:w="1300"/>
             <w:tcBorders>
               <w:top w:val="single" w:color="D2DCD6" w:sz="1"/>
               <w:left w:val="single" w:color="D2DCD6" w:sz="1"/>
@@ -119,16 +121,16 @@
               <w:rPr>
                 <w:b/>
                 <w:bCs/>
-                <w:sz w:val="20"/>
-                <w:szCs w:val="20"/>
-              </w:rPr>
-              <w:t xml:space="preserve">Versão</w:t>
-            </w:r>
-          </w:p>
-        </w:tc>
-        <w:tc>
-          <w:tcPr>
-            <w:tcW w:type="dxa" w:w="4819"/>
+                <w:sz w:val="17"/>
+                <w:szCs w:val="17"/>
+              </w:rPr>
+              <w:t xml:space="preserve">Data</w:t>
+            </w:r>
+          </w:p>
+        </w:tc>
+        <w:tc>
+          <w:tcPr>
+            <w:tcW w:type="dxa" w:w="700"/>
             <w:tcBorders>
               <w:top w:val="single" w:color="D2DCD6" w:sz="1"/>
               <w:left w:val="single" w:color="D2DCD6" w:sz="1"/>
@@ -151,10 +153,74 @@
               <w:rPr>
                 <w:b/>
                 <w:bCs/>
-                <w:sz w:val="20"/>
-                <w:szCs w:val="20"/>
-              </w:rPr>
-              <w:t xml:space="preserve">Referência e mudança</w:t>
+                <w:sz w:val="17"/>
+                <w:szCs w:val="17"/>
+              </w:rPr>
+              <w:t xml:space="preserve">Versão</w:t>
+            </w:r>
+          </w:p>
+        </w:tc>
+        <w:tc>
+          <w:tcPr>
+            <w:tcW w:type="dxa" w:w="5700"/>
+            <w:tcBorders>
+              <w:top w:val="single" w:color="D2DCD6" w:sz="1"/>
+              <w:left w:val="single" w:color="D2DCD6" w:sz="1"/>
+              <w:bottom w:val="single" w:color="D2DCD6" w:sz="1"/>
+              <w:right w:val="single" w:color="D2DCD6" w:sz="1"/>
+            </w:tcBorders>
+            <w:shd w:fill="EAF2EC" w:val="clear"/>
+            <w:tcMar>
+              <w:top w:type="dxa" w:w="80"/>
+              <w:left w:type="dxa" w:w="100"/>
+              <w:bottom w:type="dxa" w:w="80"/>
+              <w:right w:type="dxa" w:w="100"/>
+            </w:tcMar>
+          </w:tcPr>
+          <w:p>
+            <w:pPr>
+              <w:spacing w:after="40"/>
+            </w:pPr>
+            <w:r>
+              <w:rPr>
+                <w:b/>
+                <w:bCs/>
+                <w:sz w:val="17"/>
+                <w:szCs w:val="17"/>
+              </w:rPr>
+              <w:t xml:space="preserve">Descrição da revisão</w:t>
+            </w:r>
+          </w:p>
+        </w:tc>
+        <w:tc>
+          <w:tcPr>
+            <w:tcW w:type="dxa" w:w="1938"/>
+            <w:tcBorders>
+              <w:top w:val="single" w:color="D2DCD6" w:sz="1"/>
+              <w:left w:val="single" w:color="D2DCD6" w:sz="1"/>
+              <w:bottom w:val="single" w:color="D2DCD6" w:sz="1"/>
+              <w:right w:val="single" w:color="D2DCD6" w:sz="1"/>
+            </w:tcBorders>
+            <w:shd w:fill="EAF2EC" w:val="clear"/>
+            <w:tcMar>
+              <w:top w:type="dxa" w:w="80"/>
+              <w:left w:type="dxa" w:w="100"/>
+              <w:bottom w:type="dxa" w:w="80"/>
+              <w:right w:type="dxa" w:w="100"/>
+            </w:tcMar>
+          </w:tcPr>
+          <w:p>
+            <w:pPr>
+              <w:spacing w:after="40"/>
+            </w:pPr>
+            <w:r>
+              <w:rPr>
+                <w:b/>
+                <w:bCs/>
+                <w:sz w:val="17"/>
+                <w:szCs w:val="17"/>
+              </w:rPr>
+              <w:t xml:space="preserve">Autor</w:t>
             </w:r>
           </w:p>
         </w:tc>
@@ -166,31 +232,63 @@
         </w:trPr>
         <w:tc>
           <w:tcPr>
-            <w:tcW w:type="dxa" w:w="4819"/>
-            <w:tcBorders>
-              <w:top w:val="single" w:color="D2DCD6" w:sz="1"/>
-              <w:left w:val="single" w:color="D2DCD6" w:sz="1"/>
-              <w:bottom w:val="single" w:color="D2DCD6" w:sz="1"/>
-              <w:right w:val="single" w:color="D2DCD6" w:sz="1"/>
-            </w:tcBorders>
-            <w:shd w:fill="FFFFFF" w:val="clear"/>
-            <w:tcMar>
-              <w:top w:type="dxa" w:w="80"/>
-              <w:left w:type="dxa" w:w="100"/>
-              <w:bottom w:type="dxa" w:w="80"/>
-              <w:right w:type="dxa" w:w="100"/>
-            </w:tcMar>
-          </w:tcPr>
-          <w:p>
-            <w:pPr>
-              <w:spacing w:after="40"/>
-            </w:pPr>
-            <w:r>
-              <w:rPr>
-                <w:b w:val="false"/>
-                <w:bCs w:val="false"/>
-                <w:sz w:val="20"/>
-                <w:szCs w:val="20"/>
+            <w:tcW w:type="dxa" w:w="1300"/>
+            <w:tcBorders>
+              <w:top w:val="single" w:color="D2DCD6" w:sz="1"/>
+              <w:left w:val="single" w:color="D2DCD6" w:sz="1"/>
+              <w:bottom w:val="single" w:color="D2DCD6" w:sz="1"/>
+              <w:right w:val="single" w:color="D2DCD6" w:sz="1"/>
+            </w:tcBorders>
+            <w:shd w:fill="FFFFFF" w:val="clear"/>
+            <w:tcMar>
+              <w:top w:type="dxa" w:w="80"/>
+              <w:left w:type="dxa" w:w="100"/>
+              <w:bottom w:type="dxa" w:w="80"/>
+              <w:right w:type="dxa" w:w="100"/>
+            </w:tcMar>
+          </w:tcPr>
+          <w:p>
+            <w:pPr>
+              <w:spacing w:after="40"/>
+            </w:pPr>
+            <w:r>
+              <w:rPr>
+                <w:b w:val="false"/>
+                <w:bCs w:val="false"/>
+                <w:sz w:val="17"/>
+                <w:szCs w:val="17"/>
+              </w:rPr>
+              <w:t xml:space="preserve">21/08/2026</w:t>
+            </w:r>
+          </w:p>
+        </w:tc>
+        <w:tc>
+          <w:tcPr>
+            <w:tcW w:type="dxa" w:w="700"/>
+            <w:tcBorders>
+              <w:top w:val="single" w:color="D2DCD6" w:sz="1"/>
+              <w:left w:val="single" w:color="D2DCD6" w:sz="1"/>
+              <w:bottom w:val="single" w:color="D2DCD6" w:sz="1"/>
+              <w:right w:val="single" w:color="D2DCD6" w:sz="1"/>
+            </w:tcBorders>
+            <w:shd w:fill="FFFFFF" w:val="clear"/>
+            <w:tcMar>
+              <w:top w:type="dxa" w:w="80"/>
+              <w:left w:type="dxa" w:w="100"/>
+              <w:bottom w:type="dxa" w:w="80"/>
+              <w:right w:type="dxa" w:w="100"/>
+            </w:tcMar>
+          </w:tcPr>
+          <w:p>
+            <w:pPr>
+              <w:spacing w:after="40"/>
+            </w:pPr>
+            <w:r>
+              <w:rPr>
+                <w:b w:val="false"/>
+                <w:bCs w:val="false"/>
+                <w:sz w:val="17"/>
+                <w:szCs w:val="17"/>
               </w:rPr>
               <w:t xml:space="preserve">1.0</w:t>
             </w:r>
@@ -198,33 +296,65 @@
         </w:tc>
         <w:tc>
           <w:tcPr>
-            <w:tcW w:type="dxa" w:w="4819"/>
-            <w:tcBorders>
-              <w:top w:val="single" w:color="D2DCD6" w:sz="1"/>
-              <w:left w:val="single" w:color="D2DCD6" w:sz="1"/>
-              <w:bottom w:val="single" w:color="D2DCD6" w:sz="1"/>
-              <w:right w:val="single" w:color="D2DCD6" w:sz="1"/>
-            </w:tcBorders>
-            <w:shd w:fill="FFFFFF" w:val="clear"/>
-            <w:tcMar>
-              <w:top w:type="dxa" w:w="80"/>
-              <w:left w:type="dxa" w:w="100"/>
-              <w:bottom w:type="dxa" w:w="80"/>
-              <w:right w:type="dxa" w:w="100"/>
-            </w:tcMar>
-          </w:tcPr>
-          <w:p>
-            <w:pPr>
-              <w:spacing w:after="40"/>
-            </w:pPr>
-            <w:r>
-              <w:rPr>
-                <w:b w:val="false"/>
-                <w:bCs w:val="false"/>
-                <w:sz w:val="20"/>
-                <w:szCs w:val="20"/>
-              </w:rPr>
-              <w:t xml:space="preserve">ERS original entregue na Sprint 1 (../referencias/ERS-Sprint-1-original.pdf), de 21/08/2026: 24 RF especificados, 16 RNF e 16 RN</w:t>
+            <w:tcW w:type="dxa" w:w="5700"/>
+            <w:tcBorders>
+              <w:top w:val="single" w:color="D2DCD6" w:sz="1"/>
+              <w:left w:val="single" w:color="D2DCD6" w:sz="1"/>
+              <w:bottom w:val="single" w:color="D2DCD6" w:sz="1"/>
+              <w:right w:val="single" w:color="D2DCD6" w:sz="1"/>
+            </w:tcBorders>
+            <w:shd w:fill="FFFFFF" w:val="clear"/>
+            <w:tcMar>
+              <w:top w:type="dxa" w:w="80"/>
+              <w:left w:type="dxa" w:w="100"/>
+              <w:bottom w:type="dxa" w:w="80"/>
+              <w:right w:type="dxa" w:w="100"/>
+            </w:tcMar>
+          </w:tcPr>
+          <w:p>
+            <w:pPr>
+              <w:spacing w:after="40"/>
+            </w:pPr>
+            <w:r>
+              <w:rPr>
+                <w:b w:val="false"/>
+                <w:bCs w:val="false"/>
+                <w:sz w:val="17"/>
+                <w:szCs w:val="17"/>
+              </w:rPr>
+              <w:t xml:space="preserve">ERS original da Sprint 1 (../referencias/ERS-Sprint-1-original.pdf): 24 RF especificados, 16 RNF e 16 RN; documento e template preservados</w:t>
+            </w:r>
+          </w:p>
+        </w:tc>
+        <w:tc>
+          <w:tcPr>
+            <w:tcW w:type="dxa" w:w="1938"/>
+            <w:tcBorders>
+              <w:top w:val="single" w:color="D2DCD6" w:sz="1"/>
+              <w:left w:val="single" w:color="D2DCD6" w:sz="1"/>
+              <w:bottom w:val="single" w:color="D2DCD6" w:sz="1"/>
+              <w:right w:val="single" w:color="D2DCD6" w:sz="1"/>
+            </w:tcBorders>
+            <w:shd w:fill="FFFFFF" w:val="clear"/>
+            <w:tcMar>
+              <w:top w:type="dxa" w:w="80"/>
+              <w:left w:type="dxa" w:w="100"/>
+              <w:bottom w:type="dxa" w:w="80"/>
+              <w:right w:type="dxa" w:w="100"/>
+            </w:tcMar>
+          </w:tcPr>
+          <w:p>
+            <w:pPr>
+              <w:spacing w:after="40"/>
+            </w:pPr>
+            <w:r>
+              <w:rPr>
+                <w:b w:val="false"/>
+                <w:bCs w:val="false"/>
+                <w:sz w:val="17"/>
+                <w:szCs w:val="17"/>
+              </w:rPr>
+              <w:t xml:space="preserve">Equipe LinkAtletas</w:t>
             </w:r>
           </w:p>
         </w:tc>
@@ -236,31 +366,63 @@
         </w:trPr>
         <w:tc>
           <w:tcPr>
-            <w:tcW w:type="dxa" w:w="4819"/>
-            <w:tcBorders>
-              <w:top w:val="single" w:color="D2DCD6" w:sz="1"/>
-              <w:left w:val="single" w:color="D2DCD6" w:sz="1"/>
-              <w:bottom w:val="single" w:color="D2DCD6" w:sz="1"/>
-              <w:right w:val="single" w:color="D2DCD6" w:sz="1"/>
-            </w:tcBorders>
-            <w:shd w:fill="FFFFFF" w:val="clear"/>
-            <w:tcMar>
-              <w:top w:type="dxa" w:w="80"/>
-              <w:left w:type="dxa" w:w="100"/>
-              <w:bottom w:type="dxa" w:w="80"/>
-              <w:right w:type="dxa" w:w="100"/>
-            </w:tcMar>
-          </w:tcPr>
-          <w:p>
-            <w:pPr>
-              <w:spacing w:after="40"/>
-            </w:pPr>
-            <w:r>
-              <w:rPr>
-                <w:b w:val="false"/>
-                <w:bCs w:val="false"/>
-                <w:sz w:val="20"/>
-                <w:szCs w:val="20"/>
+            <w:tcW w:type="dxa" w:w="1300"/>
+            <w:tcBorders>
+              <w:top w:val="single" w:color="D2DCD6" w:sz="1"/>
+              <w:left w:val="single" w:color="D2DCD6" w:sz="1"/>
+              <w:bottom w:val="single" w:color="D2DCD6" w:sz="1"/>
+              <w:right w:val="single" w:color="D2DCD6" w:sz="1"/>
+            </w:tcBorders>
+            <w:shd w:fill="FFFFFF" w:val="clear"/>
+            <w:tcMar>
+              <w:top w:type="dxa" w:w="80"/>
+              <w:left w:type="dxa" w:w="100"/>
+              <w:bottom w:type="dxa" w:w="80"/>
+              <w:right w:type="dxa" w:w="100"/>
+            </w:tcMar>
+          </w:tcPr>
+          <w:p>
+            <w:pPr>
+              <w:spacing w:after="40"/>
+            </w:pPr>
+            <w:r>
+              <w:rPr>
+                <w:b w:val="false"/>
+                <w:bCs w:val="false"/>
+                <w:sz w:val="17"/>
+                <w:szCs w:val="17"/>
+              </w:rPr>
+              <w:t xml:space="preserve">14/10/2026</w:t>
+            </w:r>
+          </w:p>
+        </w:tc>
+        <w:tc>
+          <w:tcPr>
+            <w:tcW w:type="dxa" w:w="700"/>
+            <w:tcBorders>
+              <w:top w:val="single" w:color="D2DCD6" w:sz="1"/>
+              <w:left w:val="single" w:color="D2DCD6" w:sz="1"/>
+              <w:bottom w:val="single" w:color="D2DCD6" w:sz="1"/>
+              <w:right w:val="single" w:color="D2DCD6" w:sz="1"/>
+            </w:tcBorders>
+            <w:shd w:fill="FFFFFF" w:val="clear"/>
+            <w:tcMar>
+              <w:top w:type="dxa" w:w="80"/>
+              <w:left w:type="dxa" w:w="100"/>
+              <w:bottom w:type="dxa" w:w="80"/>
+              <w:right w:type="dxa" w:w="100"/>
+            </w:tcMar>
+          </w:tcPr>
+          <w:p>
+            <w:pPr>
+              <w:spacing w:after="40"/>
+            </w:pPr>
+            <w:r>
+              <w:rPr>
+                <w:b w:val="false"/>
+                <w:bCs w:val="false"/>
+                <w:sz w:val="17"/>
+                <w:szCs w:val="17"/>
               </w:rPr>
               <w:t xml:space="preserve">1.1</w:t>
             </w:r>
@@ -268,33 +430,65 @@
         </w:tc>
         <w:tc>
           <w:tcPr>
-            <w:tcW w:type="dxa" w:w="4819"/>
-            <w:tcBorders>
-              <w:top w:val="single" w:color="D2DCD6" w:sz="1"/>
-              <w:left w:val="single" w:color="D2DCD6" w:sz="1"/>
-              <w:bottom w:val="single" w:color="D2DCD6" w:sz="1"/>
-              <w:right w:val="single" w:color="D2DCD6" w:sz="1"/>
-            </w:tcBorders>
-            <w:shd w:fill="FFFFFF" w:val="clear"/>
-            <w:tcMar>
-              <w:top w:type="dxa" w:w="80"/>
-              <w:left w:type="dxa" w:w="100"/>
-              <w:bottom w:type="dxa" w:w="80"/>
-              <w:right w:type="dxa" w:w="100"/>
-            </w:tcMar>
-          </w:tcPr>
-          <w:p>
-            <w:pPr>
-              <w:spacing w:after="40"/>
-            </w:pPr>
-            <w:r>
-              <w:rPr>
-                <w:b w:val="false"/>
-                <w:bCs w:val="false"/>
-                <w:sz w:val="20"/>
-                <w:szCs w:val="20"/>
-              </w:rPr>
-              <w:t xml:space="preserve">Incremento web inicial (../sprint-2/ERS-v1.1.md): API, PostgreSQL e fluxo esportivo completo; evidências históricas preservadas</w:t>
+            <w:tcW w:type="dxa" w:w="5700"/>
+            <w:tcBorders>
+              <w:top w:val="single" w:color="D2DCD6" w:sz="1"/>
+              <w:left w:val="single" w:color="D2DCD6" w:sz="1"/>
+              <w:bottom w:val="single" w:color="D2DCD6" w:sz="1"/>
+              <w:right w:val="single" w:color="D2DCD6" w:sz="1"/>
+            </w:tcBorders>
+            <w:shd w:fill="FFFFFF" w:val="clear"/>
+            <w:tcMar>
+              <w:top w:type="dxa" w:w="80"/>
+              <w:left w:type="dxa" w:w="100"/>
+              <w:bottom w:type="dxa" w:w="80"/>
+              <w:right w:type="dxa" w:w="100"/>
+            </w:tcMar>
+          </w:tcPr>
+          <w:p>
+            <w:pPr>
+              <w:spacing w:after="40"/>
+            </w:pPr>
+            <w:r>
+              <w:rPr>
+                <w:b w:val="false"/>
+                <w:bCs w:val="false"/>
+                <w:sz w:val="17"/>
+                <w:szCs w:val="17"/>
+              </w:rPr>
+              <w:t xml:space="preserve">Incremento web inicial (../sprint-2/ERS-v1.1.md): API, PostgreSQL, fluxo esportivo integrado e cenários de verificação</w:t>
+            </w:r>
+          </w:p>
+        </w:tc>
+        <w:tc>
+          <w:tcPr>
+            <w:tcW w:type="dxa" w:w="1938"/>
+            <w:tcBorders>
+              <w:top w:val="single" w:color="D2DCD6" w:sz="1"/>
+              <w:left w:val="single" w:color="D2DCD6" w:sz="1"/>
+              <w:bottom w:val="single" w:color="D2DCD6" w:sz="1"/>
+              <w:right w:val="single" w:color="D2DCD6" w:sz="1"/>
+            </w:tcBorders>
+            <w:shd w:fill="FFFFFF" w:val="clear"/>
+            <w:tcMar>
+              <w:top w:type="dxa" w:w="80"/>
+              <w:left w:type="dxa" w:w="100"/>
+              <w:bottom w:type="dxa" w:w="80"/>
+              <w:right w:type="dxa" w:w="100"/>
+            </w:tcMar>
+          </w:tcPr>
+          <w:p>
+            <w:pPr>
+              <w:spacing w:after="40"/>
+            </w:pPr>
+            <w:r>
+              <w:rPr>
+                <w:b w:val="false"/>
+                <w:bCs w:val="false"/>
+                <w:sz w:val="17"/>
+                <w:szCs w:val="17"/>
+              </w:rPr>
+              <w:t xml:space="preserve">Lucca Castilho Costa</w:t>
             </w:r>
           </w:p>
         </w:tc>
@@ -306,31 +500,63 @@
         </w:trPr>
         <w:tc>
           <w:tcPr>
-            <w:tcW w:type="dxa" w:w="4819"/>
-            <w:tcBorders>
-              <w:top w:val="single" w:color="D2DCD6" w:sz="1"/>
-              <w:left w:val="single" w:color="D2DCD6" w:sz="1"/>
-              <w:bottom w:val="single" w:color="D2DCD6" w:sz="1"/>
-              <w:right w:val="single" w:color="D2DCD6" w:sz="1"/>
-            </w:tcBorders>
-            <w:shd w:fill="FFFFFF" w:val="clear"/>
-            <w:tcMar>
-              <w:top w:type="dxa" w:w="80"/>
-              <w:left w:type="dxa" w:w="100"/>
-              <w:bottom w:type="dxa" w:w="80"/>
-              <w:right w:type="dxa" w:w="100"/>
-            </w:tcMar>
-          </w:tcPr>
-          <w:p>
-            <w:pPr>
-              <w:spacing w:after="40"/>
-            </w:pPr>
-            <w:r>
-              <w:rPr>
-                <w:b w:val="false"/>
-                <w:bCs w:val="false"/>
-                <w:sz w:val="20"/>
-                <w:szCs w:val="20"/>
+            <w:tcW w:type="dxa" w:w="1300"/>
+            <w:tcBorders>
+              <w:top w:val="single" w:color="D2DCD6" w:sz="1"/>
+              <w:left w:val="single" w:color="D2DCD6" w:sz="1"/>
+              <w:bottom w:val="single" w:color="D2DCD6" w:sz="1"/>
+              <w:right w:val="single" w:color="D2DCD6" w:sz="1"/>
+            </w:tcBorders>
+            <w:shd w:fill="FFFFFF" w:val="clear"/>
+            <w:tcMar>
+              <w:top w:type="dxa" w:w="80"/>
+              <w:left w:type="dxa" w:w="100"/>
+              <w:bottom w:type="dxa" w:w="80"/>
+              <w:right w:type="dxa" w:w="100"/>
+            </w:tcMar>
+          </w:tcPr>
+          <w:p>
+            <w:pPr>
+              <w:spacing w:after="40"/>
+            </w:pPr>
+            <w:r>
+              <w:rPr>
+                <w:b w:val="false"/>
+                <w:bCs w:val="false"/>
+                <w:sz w:val="17"/>
+                <w:szCs w:val="17"/>
+              </w:rPr>
+              <w:t xml:space="preserve">14/10/2026</w:t>
+            </w:r>
+          </w:p>
+        </w:tc>
+        <w:tc>
+          <w:tcPr>
+            <w:tcW w:type="dxa" w:w="700"/>
+            <w:tcBorders>
+              <w:top w:val="single" w:color="D2DCD6" w:sz="1"/>
+              <w:left w:val="single" w:color="D2DCD6" w:sz="1"/>
+              <w:bottom w:val="single" w:color="D2DCD6" w:sz="1"/>
+              <w:right w:val="single" w:color="D2DCD6" w:sz="1"/>
+            </w:tcBorders>
+            <w:shd w:fill="FFFFFF" w:val="clear"/>
+            <w:tcMar>
+              <w:top w:type="dxa" w:w="80"/>
+              <w:left w:type="dxa" w:w="100"/>
+              <w:bottom w:type="dxa" w:w="80"/>
+              <w:right w:type="dxa" w:w="100"/>
+            </w:tcMar>
+          </w:tcPr>
+          <w:p>
+            <w:pPr>
+              <w:spacing w:after="40"/>
+            </w:pPr>
+            <w:r>
+              <w:rPr>
+                <w:b w:val="false"/>
+                <w:bCs w:val="false"/>
+                <w:sz w:val="17"/>
+                <w:szCs w:val="17"/>
               </w:rPr>
               <w:t xml:space="preserve">2.0</w:t>
             </w:r>
@@ -338,33 +564,65 @@
         </w:tc>
         <w:tc>
           <w:tcPr>
-            <w:tcW w:type="dxa" w:w="4819"/>
-            <w:tcBorders>
-              <w:top w:val="single" w:color="D2DCD6" w:sz="1"/>
-              <w:left w:val="single" w:color="D2DCD6" w:sz="1"/>
-              <w:bottom w:val="single" w:color="D2DCD6" w:sz="1"/>
-              <w:right w:val="single" w:color="D2DCD6" w:sz="1"/>
-            </w:tcBorders>
-            <w:shd w:fill="FFFFFF" w:val="clear"/>
-            <w:tcMar>
-              <w:top w:type="dxa" w:w="80"/>
-              <w:left w:type="dxa" w:w="100"/>
-              <w:bottom w:type="dxa" w:w="80"/>
-              <w:right w:type="dxa" w:w="100"/>
-            </w:tcMar>
-          </w:tcPr>
-          <w:p>
-            <w:pPr>
-              <w:spacing w:after="40"/>
-            </w:pPr>
-            <w:r>
-              <w:rPr>
-                <w:b w:val="false"/>
-                <w:bCs w:val="false"/>
-                <w:sz w:val="20"/>
-                <w:szCs w:val="20"/>
-              </w:rPr>
-              <w:t xml:space="preserve">Ampliação aprovada (../superpowers/specs/2026-10-14-expansao-completa-design.md): comunicação, mídia, privacidade, recuperação, ciclos, financeiro e cliente nativo</w:t>
+            <w:tcW w:type="dxa" w:w="5700"/>
+            <w:tcBorders>
+              <w:top w:val="single" w:color="D2DCD6" w:sz="1"/>
+              <w:left w:val="single" w:color="D2DCD6" w:sz="1"/>
+              <w:bottom w:val="single" w:color="D2DCD6" w:sz="1"/>
+              <w:right w:val="single" w:color="D2DCD6" w:sz="1"/>
+            </w:tcBorders>
+            <w:shd w:fill="FFFFFF" w:val="clear"/>
+            <w:tcMar>
+              <w:top w:type="dxa" w:w="80"/>
+              <w:left w:type="dxa" w:w="100"/>
+              <w:bottom w:type="dxa" w:w="80"/>
+              <w:right w:type="dxa" w:w="100"/>
+            </w:tcMar>
+          </w:tcPr>
+          <w:p>
+            <w:pPr>
+              <w:spacing w:after="40"/>
+            </w:pPr>
+            <w:r>
+              <w:rPr>
+                <w:b w:val="false"/>
+                <w:bCs w:val="false"/>
+                <w:sz w:val="17"/>
+                <w:szCs w:val="17"/>
+              </w:rPr>
+              <w:t xml:space="preserve">Ampliação (../superpowers/specs/2026-10-14-expansao-completa-design.md): comunicação, mídia, privacidade, recuperação, ciclos, financeiro e cliente nativo</w:t>
+            </w:r>
+          </w:p>
+        </w:tc>
+        <w:tc>
+          <w:tcPr>
+            <w:tcW w:type="dxa" w:w="1938"/>
+            <w:tcBorders>
+              <w:top w:val="single" w:color="D2DCD6" w:sz="1"/>
+              <w:left w:val="single" w:color="D2DCD6" w:sz="1"/>
+              <w:bottom w:val="single" w:color="D2DCD6" w:sz="1"/>
+              <w:right w:val="single" w:color="D2DCD6" w:sz="1"/>
+            </w:tcBorders>
+            <w:shd w:fill="FFFFFF" w:val="clear"/>
+            <w:tcMar>
+              <w:top w:type="dxa" w:w="80"/>
+              <w:left w:type="dxa" w:w="100"/>
+              <w:bottom w:type="dxa" w:w="80"/>
+              <w:right w:type="dxa" w:w="100"/>
+            </w:tcMar>
+          </w:tcPr>
+          <w:p>
+            <w:pPr>
+              <w:spacing w:after="40"/>
+            </w:pPr>
+            <w:r>
+              <w:rPr>
+                <w:b w:val="false"/>
+                <w:bCs w:val="false"/>
+                <w:sz w:val="17"/>
+                <w:szCs w:val="17"/>
+              </w:rPr>
+              <w:t xml:space="preserve">Lucca Castilho Costa</w:t>
             </w:r>
           </w:p>
         </w:tc>
@@ -376,31 +634,63 @@
         </w:trPr>
         <w:tc>
           <w:tcPr>
-            <w:tcW w:type="dxa" w:w="4819"/>
-            <w:tcBorders>
-              <w:top w:val="single" w:color="D2DCD6" w:sz="1"/>
-              <w:left w:val="single" w:color="D2DCD6" w:sz="1"/>
-              <w:bottom w:val="single" w:color="D2DCD6" w:sz="1"/>
-              <w:right w:val="single" w:color="D2DCD6" w:sz="1"/>
-            </w:tcBorders>
-            <w:shd w:fill="FFFFFF" w:val="clear"/>
-            <w:tcMar>
-              <w:top w:type="dxa" w:w="80"/>
-              <w:left w:type="dxa" w:w="100"/>
-              <w:bottom w:type="dxa" w:w="80"/>
-              <w:right w:type="dxa" w:w="100"/>
-            </w:tcMar>
-          </w:tcPr>
-          <w:p>
-            <w:pPr>
-              <w:spacing w:after="40"/>
-            </w:pPr>
-            <w:r>
-              <w:rPr>
-                <w:b w:val="false"/>
-                <w:bCs w:val="false"/>
-                <w:sz w:val="20"/>
-                <w:szCs w:val="20"/>
+            <w:tcW w:type="dxa" w:w="1300"/>
+            <w:tcBorders>
+              <w:top w:val="single" w:color="D2DCD6" w:sz="1"/>
+              <w:left w:val="single" w:color="D2DCD6" w:sz="1"/>
+              <w:bottom w:val="single" w:color="D2DCD6" w:sz="1"/>
+              <w:right w:val="single" w:color="D2DCD6" w:sz="1"/>
+            </w:tcBorders>
+            <w:shd w:fill="FFFFFF" w:val="clear"/>
+            <w:tcMar>
+              <w:top w:type="dxa" w:w="80"/>
+              <w:left w:type="dxa" w:w="100"/>
+              <w:bottom w:type="dxa" w:w="80"/>
+              <w:right w:type="dxa" w:w="100"/>
+            </w:tcMar>
+          </w:tcPr>
+          <w:p>
+            <w:pPr>
+              <w:spacing w:after="40"/>
+            </w:pPr>
+            <w:r>
+              <w:rPr>
+                <w:b w:val="false"/>
+                <w:bCs w:val="false"/>
+                <w:sz w:val="17"/>
+                <w:szCs w:val="17"/>
+              </w:rPr>
+              <w:t xml:space="preserve">21/10/2026</w:t>
+            </w:r>
+          </w:p>
+        </w:tc>
+        <w:tc>
+          <w:tcPr>
+            <w:tcW w:type="dxa" w:w="700"/>
+            <w:tcBorders>
+              <w:top w:val="single" w:color="D2DCD6" w:sz="1"/>
+              <w:left w:val="single" w:color="D2DCD6" w:sz="1"/>
+              <w:bottom w:val="single" w:color="D2DCD6" w:sz="1"/>
+              <w:right w:val="single" w:color="D2DCD6" w:sz="1"/>
+            </w:tcBorders>
+            <w:shd w:fill="FFFFFF" w:val="clear"/>
+            <w:tcMar>
+              <w:top w:type="dxa" w:w="80"/>
+              <w:left w:type="dxa" w:w="100"/>
+              <w:bottom w:type="dxa" w:w="80"/>
+              <w:right w:type="dxa" w:w="100"/>
+            </w:tcMar>
+          </w:tcPr>
+          <w:p>
+            <w:pPr>
+              <w:spacing w:after="40"/>
+            </w:pPr>
+            <w:r>
+              <w:rPr>
+                <w:b w:val="false"/>
+                <w:bCs w:val="false"/>
+                <w:sz w:val="17"/>
+                <w:szCs w:val="17"/>
               </w:rPr>
               <w:t xml:space="preserve">2.1</w:t>
             </w:r>
@@ -408,38 +698,222 @@
         </w:tc>
         <w:tc>
           <w:tcPr>
-            <w:tcW w:type="dxa" w:w="4819"/>
-            <w:tcBorders>
-              <w:top w:val="single" w:color="D2DCD6" w:sz="1"/>
-              <w:left w:val="single" w:color="D2DCD6" w:sz="1"/>
-              <w:bottom w:val="single" w:color="D2DCD6" w:sz="1"/>
-              <w:right w:val="single" w:color="D2DCD6" w:sz="1"/>
-            </w:tcBorders>
-            <w:shd w:fill="FFFFFF" w:val="clear"/>
-            <w:tcMar>
-              <w:top w:type="dxa" w:w="80"/>
-              <w:left w:type="dxa" w:w="100"/>
-              <w:bottom w:type="dxa" w:w="80"/>
-              <w:right w:type="dxa" w:w="100"/>
-            </w:tcMar>
-          </w:tcPr>
-          <w:p>
-            <w:pPr>
-              <w:spacing w:after="40"/>
-            </w:pPr>
-            <w:r>
-              <w:rPr>
-                <w:b w:val="false"/>
-                <w:bCs w:val="false"/>
-                <w:sz w:val="20"/>
-                <w:szCs w:val="20"/>
-              </w:rPr>
-              <w:t xml:space="preserve">Revisão dos materiais originais, DER conferido contra 36 tabelas/257 colunas/45 FKs, perfil Android local e correções de privacidade/backup; revisão e divergências (revisao-materiais.md)</w:t>
+            <w:tcW w:type="dxa" w:w="5700"/>
+            <w:tcBorders>
+              <w:top w:val="single" w:color="D2DCD6" w:sz="1"/>
+              <w:left w:val="single" w:color="D2DCD6" w:sz="1"/>
+              <w:bottom w:val="single" w:color="D2DCD6" w:sz="1"/>
+              <w:right w:val="single" w:color="D2DCD6" w:sz="1"/>
+            </w:tcBorders>
+            <w:shd w:fill="FFFFFF" w:val="clear"/>
+            <w:tcMar>
+              <w:top w:type="dxa" w:w="80"/>
+              <w:left w:type="dxa" w:w="100"/>
+              <w:bottom w:type="dxa" w:w="80"/>
+              <w:right w:type="dxa" w:w="100"/>
+            </w:tcMar>
+          </w:tcPr>
+          <w:p>
+            <w:pPr>
+              <w:spacing w:after="40"/>
+            </w:pPr>
+            <w:r>
+              <w:rPr>
+                <w:b w:val="false"/>
+                <w:bCs w:val="false"/>
+                <w:sz w:val="17"/>
+                <w:szCs w:val="17"/>
+              </w:rPr>
+              <w:t xml:space="preserve">Consolidação das revisões de 15–21/10: modelos físicos conferidos, correções de privacidade/backup/upload, perfil Android local, 18 etapas do APK, publicação e evidências de testes</w:t>
+            </w:r>
+          </w:p>
+        </w:tc>
+        <w:tc>
+          <w:tcPr>
+            <w:tcW w:type="dxa" w:w="1938"/>
+            <w:tcBorders>
+              <w:top w:val="single" w:color="D2DCD6" w:sz="1"/>
+              <w:left w:val="single" w:color="D2DCD6" w:sz="1"/>
+              <w:bottom w:val="single" w:color="D2DCD6" w:sz="1"/>
+              <w:right w:val="single" w:color="D2DCD6" w:sz="1"/>
+            </w:tcBorders>
+            <w:shd w:fill="FFFFFF" w:val="clear"/>
+            <w:tcMar>
+              <w:top w:type="dxa" w:w="80"/>
+              <w:left w:type="dxa" w:w="100"/>
+              <w:bottom w:type="dxa" w:w="80"/>
+              <w:right w:type="dxa" w:w="100"/>
+            </w:tcMar>
+          </w:tcPr>
+          <w:p>
+            <w:pPr>
+              <w:spacing w:after="40"/>
+            </w:pPr>
+            <w:r>
+              <w:rPr>
+                <w:b w:val="false"/>
+                <w:bCs w:val="false"/>
+                <w:sz w:val="17"/>
+                <w:szCs w:val="17"/>
+              </w:rPr>
+              <w:t xml:space="preserve">Lucca Castilho Costa</w:t>
+            </w:r>
+          </w:p>
+        </w:tc>
+      </w:tr>
+      <w:tr>
+        <w:trPr>
+          <w:cantSplit/>
+          <w:tblHeader w:val="off"/>
+        </w:trPr>
+        <w:tc>
+          <w:tcPr>
+            <w:tcW w:type="dxa" w:w="1300"/>
+            <w:tcBorders>
+              <w:top w:val="single" w:color="D2DCD6" w:sz="1"/>
+              <w:left w:val="single" w:color="D2DCD6" w:sz="1"/>
+              <w:bottom w:val="single" w:color="D2DCD6" w:sz="1"/>
+              <w:right w:val="single" w:color="D2DCD6" w:sz="1"/>
+            </w:tcBorders>
+            <w:shd w:fill="FFFFFF" w:val="clear"/>
+            <w:tcMar>
+              <w:top w:type="dxa" w:w="80"/>
+              <w:left w:type="dxa" w:w="100"/>
+              <w:bottom w:type="dxa" w:w="80"/>
+              <w:right w:type="dxa" w:w="100"/>
+            </w:tcMar>
+          </w:tcPr>
+          <w:p>
+            <w:pPr>
+              <w:spacing w:after="40"/>
+            </w:pPr>
+            <w:r>
+              <w:rPr>
+                <w:b w:val="false"/>
+                <w:bCs w:val="false"/>
+                <w:sz w:val="17"/>
+                <w:szCs w:val="17"/>
+              </w:rPr>
+              <w:t xml:space="preserve">23/10/2026</w:t>
+            </w:r>
+          </w:p>
+        </w:tc>
+        <w:tc>
+          <w:tcPr>
+            <w:tcW w:type="dxa" w:w="700"/>
+            <w:tcBorders>
+              <w:top w:val="single" w:color="D2DCD6" w:sz="1"/>
+              <w:left w:val="single" w:color="D2DCD6" w:sz="1"/>
+              <w:bottom w:val="single" w:color="D2DCD6" w:sz="1"/>
+              <w:right w:val="single" w:color="D2DCD6" w:sz="1"/>
+            </w:tcBorders>
+            <w:shd w:fill="FFFFFF" w:val="clear"/>
+            <w:tcMar>
+              <w:top w:type="dxa" w:w="80"/>
+              <w:left w:type="dxa" w:w="100"/>
+              <w:bottom w:type="dxa" w:w="80"/>
+              <w:right w:type="dxa" w:w="100"/>
+            </w:tcMar>
+          </w:tcPr>
+          <w:p>
+            <w:pPr>
+              <w:spacing w:after="40"/>
+            </w:pPr>
+            <w:r>
+              <w:rPr>
+                <w:b w:val="false"/>
+                <w:bCs w:val="false"/>
+                <w:sz w:val="17"/>
+                <w:szCs w:val="17"/>
+              </w:rPr>
+              <w:t xml:space="preserve">2.2</w:t>
+            </w:r>
+          </w:p>
+        </w:tc>
+        <w:tc>
+          <w:tcPr>
+            <w:tcW w:type="dxa" w:w="5700"/>
+            <w:tcBorders>
+              <w:top w:val="single" w:color="D2DCD6" w:sz="1"/>
+              <w:left w:val="single" w:color="D2DCD6" w:sz="1"/>
+              <w:bottom w:val="single" w:color="D2DCD6" w:sz="1"/>
+              <w:right w:val="single" w:color="D2DCD6" w:sz="1"/>
+            </w:tcBorders>
+            <w:shd w:fill="FFFFFF" w:val="clear"/>
+            <w:tcMar>
+              <w:top w:type="dxa" w:w="80"/>
+              <w:left w:type="dxa" w:w="100"/>
+              <w:bottom w:type="dxa" w:w="80"/>
+              <w:right w:type="dxa" w:w="100"/>
+            </w:tcMar>
+          </w:tcPr>
+          <w:p>
+            <w:pPr>
+              <w:spacing w:after="40"/>
+            </w:pPr>
+            <w:r>
+              <w:rPr>
+                <w:b w:val="false"/>
+                <w:bCs w:val="false"/>
+                <w:sz w:val="17"/>
+                <w:szCs w:val="17"/>
+              </w:rPr>
+              <w:t xml:space="preserve">RF-04 e UC-02 adequados à conferência manual de CREF aceita pelo professor, conforme informação da equipe; atualização de critérios, limites externos, Eletiva I, publicação e histórico de revisões</w:t>
+            </w:r>
+          </w:p>
+        </w:tc>
+        <w:tc>
+          <w:tcPr>
+            <w:tcW w:type="dxa" w:w="1938"/>
+            <w:tcBorders>
+              <w:top w:val="single" w:color="D2DCD6" w:sz="1"/>
+              <w:left w:val="single" w:color="D2DCD6" w:sz="1"/>
+              <w:bottom w:val="single" w:color="D2DCD6" w:sz="1"/>
+              <w:right w:val="single" w:color="D2DCD6" w:sz="1"/>
+            </w:tcBorders>
+            <w:shd w:fill="FFFFFF" w:val="clear"/>
+            <w:tcMar>
+              <w:top w:type="dxa" w:w="80"/>
+              <w:left w:type="dxa" w:w="100"/>
+              <w:bottom w:type="dxa" w:w="80"/>
+              <w:right w:type="dxa" w:w="100"/>
+            </w:tcMar>
+          </w:tcPr>
+          <w:p>
+            <w:pPr>
+              <w:spacing w:after="40"/>
+            </w:pPr>
+            <w:r>
+              <w:rPr>
+                <w:b w:val="false"/>
+                <w:bCs w:val="false"/>
+                <w:sz w:val="17"/>
+                <w:szCs w:val="17"/>
+              </w:rPr>
+              <w:t xml:space="preserve">Lucca Castilho Costa</w:t>
             </w:r>
           </w:p>
         </w:tc>
       </w:tr>
     </w:tbl>
+    <w:p>
+      <w:pPr>
+        <w:spacing w:after="50"/>
+      </w:pPr>
+    </w:p>
+    <w:p>
+      <w:pPr>
+        <w:widowControl/>
+        <w:spacing w:after="100" w:line="260"/>
+      </w:pPr>
+      <w:r>
+        <w:rPr>
+          <w:b w:val="false"/>
+          <w:bCs w:val="false"/>
+        </w:rPr>
+        <w:t xml:space="preserve">As datas históricas seguem as versões preservadas e a consolidação registrada no Git. O autor da versão original permanece coletivo, sem atribuir individualmente alterações não identificadas. Esta fonte mantém o conteúdo atualizado; a adaptação ao template obrigatório será realizada posteriormente, preservando este histórico.</w:t>
+      </w:r>
+    </w:p>
     <w:p>
       <w:pPr>
         <w:spacing w:after="50"/>
@@ -1304,7 +1778,7 @@
                 <w:sz w:val="17"/>
                 <w:szCs w:val="17"/>
               </w:rPr>
-              <w:t xml:space="preserve">Validação automatizada com alternativa manual</w:t>
+              <w:t xml:space="preserve">Verificação manual de registro profissional</w:t>
             </w:r>
           </w:p>
         </w:tc>
@@ -1336,7 +1810,7 @@
                 <w:sz w:val="17"/>
                 <w:szCs w:val="17"/>
               </w:rPr>
-              <w:t xml:space="preserve">P0/P2</w:t>
+              <w:t xml:space="preserve">P0</w:t>
             </w:r>
           </w:p>
         </w:tc>
@@ -1368,7 +1842,7 @@
                 <w:sz w:val="17"/>
                 <w:szCs w:val="17"/>
               </w:rPr>
-              <w:t xml:space="preserve">Conferência manual, motivo, documento, prazo e auditoria; automação oficial depende de contrato/acesso ainda não recebido</w:t>
+              <w:t xml:space="preserve">Administrador consulta a fonte oficial e confere CREF, titularidade e situação profissional; registra decisão, motivo, evidência e validade com auditoria. Consulta automática não integra o aceite atual deste requisito; eventual integração é evolução futura</w:t>
             </w:r>
           </w:p>
         </w:tc>
@@ -5028,7 +5502,7 @@
                 <w:sz w:val="17"/>
                 <w:szCs w:val="17"/>
               </w:rPr>
-              <w:t xml:space="preserve">React Native/Expo, mesma API, token em SecureStore; tipos/bundles e homologação Android/iOS são evidências distintas</w:t>
+              <w:t xml:space="preserve">React Native/Expo, mesma API e token em SecureStore; APK Android integrado aprovado em emulador. Aparelho físico, IPA e execução em iPhone não homologados</w:t>
             </w:r>
           </w:p>
         </w:tc>
@@ -5389,7 +5863,25 @@
           <w:b w:val="false"/>
           <w:bCs w:val="false"/>
         </w:rPr>
-        <w:t xml:space="preserve">Treinador com perfil completo informa CREF/evidência e pode anexar documento privado validado → submissão pendente → administrador confere evidência → decide com motivo e prazo → grava decisão/auditoria → perfil aprovado entra na descoberta. Alternativa: recusa e nova submissão; prazo expira em job ou administrador suspende/revoga. Exceções: terceiro/atleta não submete; treinador não decide; documento alheio inválido; decisão repetida gera conflito. Somente titular e administrador autorizado veem documento. Consulta oficial automática permanece dependente de serviço autorizado.</w:t>
+        <w:t xml:space="preserve">Pré-condições: treinador autenticado com perfil completo; administrador autorizado para decidir. Fluxo principal: treinador informa CREF/evidência e pode anexar documento privado validado → submissão fica pendente → administrador consulta o portal oficial do conselho competente e compara registro, nome do titular e situação profissional → registra evidência da conferência, decisão, motivo e prazo → servidor persiste decisão/auditoria → perfil aprovado e elegível entra na descoberta. A consulta externa é uma atividade humana; o sistema não a executa nem atesta automaticamente a resposta do conselho.</w:t>
+      </w:r>
+    </w:p>
+    <w:p>
+      <w:pPr>
+        <w:spacing w:after="50"/>
+      </w:pPr>
+    </w:p>
+    <w:p>
+      <w:pPr>
+        <w:widowControl/>
+        <w:spacing w:after="100" w:line="260"/>
+      </w:pPr>
+      <w:r>
+        <w:rPr>
+          <w:b w:val="false"/>
+          <w:bCs w:val="false"/>
+        </w:rPr>
+        <w:t xml:space="preserve">Alternativas: recusa motivada e nova submissão; expiração por job; suspensão/revogação administrativa. Se a consulta oficial estiver indisponível ou os dados forem insuficientes/divergentes, a análise deve aguardar esclarecimento, sem aprovar somente pelo formato do número. Exceções: terceiro/atleta não submete; treinador não decide; documento alheio é inválido; decisão repetida gera conflito. Somente titular e administrador autorizado veem documento. Pós-condição: decisão rastreável e visibilidade condicionada a aprovação vigente. Consulta automática é evolução futura, fora do aceite atual do RF-04.</w:t>
       </w:r>
     </w:p>
     <w:p>
@@ -6143,7 +6635,7 @@
                 <w:sz w:val="20"/>
                 <w:szCs w:val="20"/>
               </w:rPr>
-              <w:t xml:space="preserve">Decidir/suspender/expirar; conferir revisor, motivo, prazo e referência; decisão/auditoria transacionais</w:t>
+              <w:t xml:space="preserve">Conferir registro/titular/situação na fonte oficial; decidir/suspender/expirar e verificar revisor, motivo, prazo e referência; decisão/auditoria transacionais</w:t>
             </w:r>
           </w:p>
         </w:tc>
@@ -6175,7 +6667,7 @@
                 <w:sz w:val="20"/>
                 <w:szCs w:val="20"/>
               </w:rPr>
-              <w:t xml:space="preserve">Administrador direto do banco continua fora da garantia de imutabilidade</w:t>
+              <w:t xml:space="preserve">Testes locais comprovam o fluxo e a persistência, não consulta automática nem habilitação de dados fictícios; administrador direto do banco fora da garantia de imutabilidade</w:t>
             </w:r>
           </w:p>
         </w:tc>
@@ -6755,7 +7247,7 @@
                 <w:sz w:val="20"/>
                 <w:szCs w:val="20"/>
               </w:rPr>
-              <w:t xml:space="preserve">Web em 390/1440 sem overflow; cliente Expo tipos/bundles</w:t>
+              <w:t xml:space="preserve">Web autenticada em 390/1440 e página pública em 320/390/1440 sem overflow; cliente Expo com tipos/bundles e fluxo Android</w:t>
             </w:r>
           </w:p>
         </w:tc>
@@ -6787,7 +7279,7 @@
                 <w:sz w:val="20"/>
                 <w:szCs w:val="20"/>
               </w:rPr>
-              <w:t xml:space="preserve">Bundle não equivale a instalação nem teste em dispositivo</w:t>
+              <w:t xml:space="preserve">Capturas e verificações conforme relatório; bundle não equivale a execução em aparelho físico</w:t>
             </w:r>
           </w:p>
         </w:tc>
@@ -7751,7 +8243,7 @@
                 <w:sz w:val="20"/>
                 <w:szCs w:val="20"/>
               </w:rPr>
-              <w:t xml:space="preserve">Aprovação registra administrador, horário, origem manual, motivo, prazo e documento quando fornecido</w:t>
+              <w:t xml:space="preserve">Administrador confere registro, titularidade e situação na fonte oficial; aprovação registra administrador, horário, origem manual, motivo/evidência, prazo e documento quando fornecido. Formato válido do número não substitui conferência profissional</w:t>
             </w:r>
           </w:p>
         </w:tc>
@@ -9313,7 +9805,7 @@
           <w:b w:val="false"/>
           <w:bCs w:val="false"/>
         </w:rPr>
-        <w:t xml:space="preserve">Revisão de escopo e execução de 15–21/10/2026</w:t>
+        <w:t xml:space="preserve">Situação da versão e evidências</w:t>
       </w:r>
     </w:p>
     <w:p>
@@ -9331,7 +9823,139 @@
           <w:b w:val="false"/>
           <w:bCs w:val="false"/>
         </w:rPr>
-        <w:t xml:space="preserve">O roteiro docente define a Sprint 2 entre 21/09 e 26/10/2026. A ERS original previa CREF automático nesta Sprint; a proposta também solicita evolução de IA. A contingência manual auditada e o match por regras são decisões implementadas e aprovadas por Lucca, mas exigem alinhamento docente para substituir esses compromissos originais. PostgreSQL substitui a menção a dois SGBDs; nuvem, iOS/lojas e autosave contínuo têm limites descritos na </w:t>
+        <w:t xml:space="preserve">A implementação ampliada e sua revisão estão publicadas na </w:t>
+      </w:r>
+      <w:r>
+        <w:rPr>
+          <w:rFonts w:ascii="Courier New" w:cs="Courier New" w:eastAsia="Courier New" w:hAnsi="Courier New"/>
+          <w:b w:val="false"/>
+          <w:bCs w:val="false"/>
+          <w:sz w:val="18"/>
+          <w:szCs w:val="18"/>
+        </w:rPr>
+        <w:t xml:space="preserve">main</w:t>
+      </w:r>
+      <w:r>
+        <w:rPr>
+          <w:b w:val="false"/>
+          <w:bCs w:val="false"/>
+        </w:rPr>
+        <w:t xml:space="preserve"> do repositório do grupo; a revisão técnica foi integrada pelo </w:t>
+      </w:r>
+      <w:hyperlink w:history="1" r:id="rIdif7vxyoq-snssx5yk1noa">
+        <w:r>
+          <w:rPr>
+            <w:rStyle w:val="Hyperlink"/>
+          </w:rPr>
+          <w:t xml:space="preserve">PR #2</w:t>
+        </w:r>
+      </w:hyperlink>
+      <w:r>
+        <w:rPr>
+          <w:b w:val="false"/>
+          <w:bCs w:val="false"/>
+        </w:rPr>
+        <w:t xml:space="preserve">. Os registros de execução comprovam 82 testes de API/unidade, 15 cenários E2E em três motores, 22 testes móveis e 18 etapas do APK Android integrado em emulador. Docker/PostgreSQL/SMTP/S3 locais, build, backup e TLS têm evidências no </w:t>
+      </w:r>
+      <w:r>
+        <w:rPr>
+          <w:b w:val="false"/>
+          <w:bCs w:val="false"/>
+        </w:rPr>
+        <w:t xml:space="preserve">relatório (relatorio-testes.md)</w:t>
+      </w:r>
+      <w:r>
+        <w:rPr>
+          <w:b w:val="false"/>
+          <w:bCs w:val="false"/>
+        </w:rPr>
+        <w:t xml:space="preserve">. Esta revisão é documental; não representa nova execução desses testes em 23/10/2026.</w:t>
+      </w:r>
+    </w:p>
+    <w:p>
+      <w:pPr>
+        <w:spacing w:after="50"/>
+      </w:pPr>
+    </w:p>
+    <w:p>
+      <w:pPr>
+        <w:widowControl/>
+        <w:spacing w:after="100" w:line="260"/>
+      </w:pPr>
+      <w:r>
+        <w:rPr>
+          <w:b w:val="false"/>
+          <w:bCs w:val="false"/>
+        </w:rPr>
+        <w:t xml:space="preserve">A </w:t>
+      </w:r>
+      <w:r>
+        <w:rPr>
+          <w:b w:val="false"/>
+          <w:bCs w:val="false"/>
+        </w:rPr>
+        <w:t xml:space="preserve">matriz curricular (rastreabilidade.md)</w:t>
+      </w:r>
+      <w:r>
+        <w:rPr>
+          <w:b w:val="false"/>
+          <w:bCs w:val="false"/>
+        </w:rPr>
+        <w:t xml:space="preserve"> inclui a Eletiva I e suas evidências. Permanecem pendentes a integração remota/nuvem prevista, o alinhamento dos demais recortes do MVP, homologações externas aplicáveis, revisão coletiva e submissões individuais. Financeiro avançado foi planejado originalmente para a Sprint 3; o código atual e seus testes controlados não comprovam operação no provedor. A automação de CREF deixa de ser pendência do aceite atual do RF-04 e fica como evolução condicionada à viabilidade de uma fonte oficial.</w:t>
+      </w:r>
+    </w:p>
+    <w:p>
+      <w:pPr>
+        <w:spacing w:after="50"/>
+      </w:pPr>
+    </w:p>
+    <w:p>
+      <w:pPr>
+        <w:pStyle w:val="Heading1"/>
+        <w:keepNext/>
+      </w:pPr>
+      <w:r>
+        <w:rPr>
+          <w:b w:val="false"/>
+          <w:bCs w:val="false"/>
+        </w:rPr>
+        <w:t xml:space="preserve">Revisão de escopo e decisões</w:t>
+      </w:r>
+    </w:p>
+    <w:p>
+      <w:pPr>
+        <w:spacing w:after="50"/>
+      </w:pPr>
+    </w:p>
+    <w:p>
+      <w:pPr>
+        <w:widowControl/>
+        <w:spacing w:after="100" w:line="260"/>
+      </w:pPr>
+      <w:r>
+        <w:rPr>
+          <w:b w:val="false"/>
+          <w:bCs w:val="false"/>
+        </w:rPr>
+        <w:t xml:space="preserve">O roteiro docente define a Sprint 2 entre 21/09 e 26/10/2026. A ERS original previa CREF automático nesta Sprint e admitia alternativa manual na indisponibilidade da API. A pesquisa não localizou API pública documentada adequada à integração; isso não comprova inexistência de acesso restrito. A equipe informou em 23/10/2026 que o professor aceita a conferência manual e solicitou sua formalização. Esta revisão incorpora esse aceite ao RF-04, UC-02 e RN-02; o registro é baseado na informação da equipe, sem fabricar assinatura, ata ou comprovação externa.</w:t>
+      </w:r>
+    </w:p>
+    <w:p>
+      <w:pPr>
+        <w:spacing w:after="50"/>
+      </w:pPr>
+    </w:p>
+    <w:p>
+      <w:pPr>
+        <w:widowControl/>
+        <w:spacing w:after="100" w:line="260"/>
+      </w:pPr>
+      <w:r>
+        <w:rPr>
+          <w:b w:val="false"/>
+          <w:bCs w:val="false"/>
+        </w:rPr>
+        <w:t xml:space="preserve">A proposta também solicita evolução de IA; o match atual segue por regras e não deve ser apresentado como modelo treinado. PostgreSQL substitui a menção a dois SGBDs; nuvem, iOS/lojas e autosave contínuo têm limites descritos na </w:t>
       </w:r>
       <w:r>
         <w:rPr>
@@ -9345,7 +9969,7 @@
           <w:b w:val="false"/>
           <w:bCs w:val="false"/>
         </w:rPr>
-        <w:t xml:space="preserve">. Os nove artefatos não comprovam aceitação integral de cada requisito original.</w:t>
+        <w:t xml:space="preserve">. O aceite de CREF manual não resolve esses assuntos nem comprova aceitação integral de cada requisito original.</w:t>
       </w:r>
     </w:p>
     <w:p>
@@ -9482,7 +10106,7 @@
         <w:sz w:val="17"/>
         <w:szCs w:val="17"/>
       </w:rPr>
-      <w:t xml:space="preserve">LinkAtletas · 21/10/2026     </w:t>
+      <w:t xml:space="preserve">LinkAtletas - 23/10/2026     </w:t>
     </w:r>
     <w:r>
       <w:rPr>

</xml_diff>

<commit_message>
atualiza a ers no template original e consolida o escopo
</commit_message>
<xml_diff>
--- a/docs/evolucao/ERS-v2.docx
+++ b/docs/evolucao/ERS-v2.docx
@@ -12,7 +12,7 @@
           <w:b w:val="false"/>
           <w:bCs w:val="false"/>
         </w:rPr>
-        <w:t xml:space="preserve">ERS v2.2 — LinkAtletas — ampliação da Sprint 2</w:t>
+        <w:t xml:space="preserve">ERS v2.3 — LinkAtletas — ampliação da Sprint 2</w:t>
       </w:r>
     </w:p>
     <w:p>
@@ -47,7 +47,7 @@
           <w:b w:val="false"/>
           <w:bCs w:val="false"/>
         </w:rPr>
-        <w:t xml:space="preserve">. Demanda SAGA nº 12871, Ivi-it; Projeto Integrador Interdisciplinar II, ADS/SENAI Félix Guisard. Prazo informado para a Sprint 2: 26/10/2026. O aceite docente da conferência manual de CREF foi informado pela equipe nesta revisão; não se estende automaticamente a outros ajustes de escopo nem comprova submissão acadêmica.</w:t>
+        <w:t xml:space="preserve">. Demanda SAGA nº 12871, Ivi-it; Projeto Integrador Interdisciplinar II, ADS/SENAI Félix Guisard. Prazo informado para a Sprint 2: 26/10/2026. O escopo desta versão é definido pela equipe; a conferência manual de CREF é o procedimento vigente.</w:t>
       </w:r>
     </w:p>
     <w:p>
@@ -858,7 +858,141 @@
                 <w:sz w:val="17"/>
                 <w:szCs w:val="17"/>
               </w:rPr>
-              <w:t xml:space="preserve">RF-04 e UC-02 adequados à conferência manual de CREF aceita pelo professor, conforme informação da equipe; atualização de critérios, limites externos, Eletiva I, publicação e histórico de revisões</w:t>
+              <w:t xml:space="preserve">RF-04 e UC-02 adequados à conferência manual de CREF; atualização de critérios, limites externos, Eletiva I, publicação e histórico de revisões</w:t>
+            </w:r>
+          </w:p>
+        </w:tc>
+        <w:tc>
+          <w:tcPr>
+            <w:tcW w:type="dxa" w:w="1938"/>
+            <w:tcBorders>
+              <w:top w:val="single" w:color="D2DCD6" w:sz="1"/>
+              <w:left w:val="single" w:color="D2DCD6" w:sz="1"/>
+              <w:bottom w:val="single" w:color="D2DCD6" w:sz="1"/>
+              <w:right w:val="single" w:color="D2DCD6" w:sz="1"/>
+            </w:tcBorders>
+            <w:shd w:fill="FFFFFF" w:val="clear"/>
+            <w:tcMar>
+              <w:top w:type="dxa" w:w="80"/>
+              <w:left w:type="dxa" w:w="100"/>
+              <w:bottom w:type="dxa" w:w="80"/>
+              <w:right w:type="dxa" w:w="100"/>
+            </w:tcMar>
+          </w:tcPr>
+          <w:p>
+            <w:pPr>
+              <w:spacing w:after="40"/>
+            </w:pPr>
+            <w:r>
+              <w:rPr>
+                <w:b w:val="false"/>
+                <w:bCs w:val="false"/>
+                <w:sz w:val="17"/>
+                <w:szCs w:val="17"/>
+              </w:rPr>
+              <w:t xml:space="preserve">Lucca Castilho Costa</w:t>
+            </w:r>
+          </w:p>
+        </w:tc>
+      </w:tr>
+      <w:tr>
+        <w:trPr>
+          <w:cantSplit/>
+          <w:tblHeader w:val="off"/>
+        </w:trPr>
+        <w:tc>
+          <w:tcPr>
+            <w:tcW w:type="dxa" w:w="1300"/>
+            <w:tcBorders>
+              <w:top w:val="single" w:color="D2DCD6" w:sz="1"/>
+              <w:left w:val="single" w:color="D2DCD6" w:sz="1"/>
+              <w:bottom w:val="single" w:color="D2DCD6" w:sz="1"/>
+              <w:right w:val="single" w:color="D2DCD6" w:sz="1"/>
+            </w:tcBorders>
+            <w:shd w:fill="FFFFFF" w:val="clear"/>
+            <w:tcMar>
+              <w:top w:type="dxa" w:w="80"/>
+              <w:left w:type="dxa" w:w="100"/>
+              <w:bottom w:type="dxa" w:w="80"/>
+              <w:right w:type="dxa" w:w="100"/>
+            </w:tcMar>
+          </w:tcPr>
+          <w:p>
+            <w:pPr>
+              <w:spacing w:after="40"/>
+            </w:pPr>
+            <w:r>
+              <w:rPr>
+                <w:b w:val="false"/>
+                <w:bCs w:val="false"/>
+                <w:sz w:val="17"/>
+                <w:szCs w:val="17"/>
+              </w:rPr>
+              <w:t xml:space="preserve">23/10/2026</w:t>
+            </w:r>
+          </w:p>
+        </w:tc>
+        <w:tc>
+          <w:tcPr>
+            <w:tcW w:type="dxa" w:w="700"/>
+            <w:tcBorders>
+              <w:top w:val="single" w:color="D2DCD6" w:sz="1"/>
+              <w:left w:val="single" w:color="D2DCD6" w:sz="1"/>
+              <w:bottom w:val="single" w:color="D2DCD6" w:sz="1"/>
+              <w:right w:val="single" w:color="D2DCD6" w:sz="1"/>
+            </w:tcBorders>
+            <w:shd w:fill="FFFFFF" w:val="clear"/>
+            <w:tcMar>
+              <w:top w:type="dxa" w:w="80"/>
+              <w:left w:type="dxa" w:w="100"/>
+              <w:bottom w:type="dxa" w:w="80"/>
+              <w:right w:type="dxa" w:w="100"/>
+            </w:tcMar>
+          </w:tcPr>
+          <w:p>
+            <w:pPr>
+              <w:spacing w:after="40"/>
+            </w:pPr>
+            <w:r>
+              <w:rPr>
+                <w:b w:val="false"/>
+                <w:bCs w:val="false"/>
+                <w:sz w:val="17"/>
+                <w:szCs w:val="17"/>
+              </w:rPr>
+              <w:t xml:space="preserve">2.3</w:t>
+            </w:r>
+          </w:p>
+        </w:tc>
+        <w:tc>
+          <w:tcPr>
+            <w:tcW w:type="dxa" w:w="5700"/>
+            <w:tcBorders>
+              <w:top w:val="single" w:color="D2DCD6" w:sz="1"/>
+              <w:left w:val="single" w:color="D2DCD6" w:sz="1"/>
+              <w:bottom w:val="single" w:color="D2DCD6" w:sz="1"/>
+              <w:right w:val="single" w:color="D2DCD6" w:sz="1"/>
+            </w:tcBorders>
+            <w:shd w:fill="FFFFFF" w:val="clear"/>
+            <w:tcMar>
+              <w:top w:type="dxa" w:w="80"/>
+              <w:left w:type="dxa" w:w="100"/>
+              <w:bottom w:type="dxa" w:w="80"/>
+              <w:right w:type="dxa" w:w="100"/>
+            </w:tcMar>
+          </w:tcPr>
+          <w:p>
+            <w:pPr>
+              <w:spacing w:after="40"/>
+            </w:pPr>
+            <w:r>
+              <w:rPr>
+                <w:b w:val="false"/>
+                <w:bCs w:val="false"/>
+                <w:sz w:val="17"/>
+                <w:szCs w:val="17"/>
+              </w:rPr>
+              <w:t xml:space="preserve">Consolidação das decisões de escopo pela equipe, retirada das pendências de aceite docente e preparação de cópia atualizada no template original, preservando a fonte da Sprint 1</w:t>
             </w:r>
           </w:p>
         </w:tc>
@@ -911,7 +1045,53 @@
           <w:b w:val="false"/>
           <w:bCs w:val="false"/>
         </w:rPr>
-        <w:t xml:space="preserve">As datas históricas seguem as versões preservadas e a consolidação registrada no Git. O autor da versão original permanece coletivo, sem atribuir individualmente alterações não identificadas. Esta fonte mantém o conteúdo atualizado; a adaptação ao template obrigatório será realizada posteriormente, preservando este histórico.</w:t>
+        <w:t xml:space="preserve">As datas históricas seguem as versões preservadas e a consolidação registrada no Git. O autor da versão original permanece coletivo, sem atribuir individualmente alterações não identificadas. Esta fonte mantém o conteúdo atualizado e o histórico utilizado na cópia do template original.</w:t>
+      </w:r>
+    </w:p>
+    <w:p>
+      <w:pPr>
+        <w:spacing w:after="50"/>
+      </w:pPr>
+    </w:p>
+    <w:p>
+      <w:pPr>
+        <w:widowControl/>
+        <w:spacing w:after="100" w:line="260"/>
+      </w:pPr>
+      <w:r>
+        <w:rPr>
+          <w:b w:val="false"/>
+          <w:bCs w:val="false"/>
+        </w:rPr>
+        <w:t xml:space="preserve">Cópia de apresentação para revisão: </w:t>
+      </w:r>
+      <w:r>
+        <w:rPr>
+          <w:b w:val="false"/>
+          <w:bCs w:val="false"/>
+        </w:rPr>
+        <w:t xml:space="preserve">PDF atualizado no template original (ERS-template-original-atualizada.pdf)</w:t>
+      </w:r>
+      <w:r>
+        <w:rPr>
+          <w:b w:val="false"/>
+          <w:bCs w:val="false"/>
+        </w:rPr>
+        <w:t xml:space="preserve">, com </w:t>
+      </w:r>
+      <w:r>
+        <w:rPr>
+          <w:b w:val="false"/>
+          <w:bCs w:val="false"/>
+        </w:rPr>
+        <w:t xml:space="preserve">método e limites de preservação (template/README.md)</w:t>
+      </w:r>
+      <w:r>
+        <w:rPr>
+          <w:b w:val="false"/>
+          <w:bCs w:val="false"/>
+        </w:rPr>
+        <w:t xml:space="preserve">. A fonte original da Sprint 1 permanece intacta.</w:t>
       </w:r>
     </w:p>
     <w:p>
@@ -9842,7 +10022,7 @@
         </w:rPr>
         <w:t xml:space="preserve"> do repositório do grupo; a revisão técnica foi integrada pelo </w:t>
       </w:r>
-      <w:hyperlink w:history="1" r:id="rIdif7vxyoq-snssx5yk1noa">
+      <w:hyperlink w:history="1" r:id="rIdkowscejrcutugvd6_bwek">
         <w:r>
           <w:rPr>
             <w:rStyle w:val="Hyperlink"/>
@@ -9901,7 +10081,7 @@
           <w:b w:val="false"/>
           <w:bCs w:val="false"/>
         </w:rPr>
-        <w:t xml:space="preserve"> inclui a Eletiva I e suas evidências. Permanecem pendentes a integração remota/nuvem prevista, o alinhamento dos demais recortes do MVP, homologações externas aplicáveis, revisão coletiva e submissões individuais. Financeiro avançado foi planejado originalmente para a Sprint 3; o código atual e seus testes controlados não comprovam operação no provedor. A automação de CREF deixa de ser pendência do aceite atual do RF-04 e fica como evolução condicionada à viabilidade de uma fonte oficial.</w:t>
+        <w:t xml:space="preserve"> inclui a Eletiva I e suas evidências. Permanecem pendentes a integração remota/nuvem prevista, homologações externas aplicáveis, revisão coletiva e submissões individuais. Os recortes e evoluções do MVP são definidos pela equipe e registrados no backlog. Financeiro avançado foi planejado originalmente para a Sprint 3; o código atual e seus testes controlados não comprovam operação no provedor. A automação de CREF não integra o requisito atual do RF-04 e fica como evolução condicionada à viabilidade de uma fonte oficial.</w:t>
       </w:r>
     </w:p>
     <w:p>
@@ -9937,7 +10117,7 @@
           <w:b w:val="false"/>
           <w:bCs w:val="false"/>
         </w:rPr>
-        <w:t xml:space="preserve">O roteiro docente define a Sprint 2 entre 21/09 e 26/10/2026. A ERS original previa CREF automático nesta Sprint e admitia alternativa manual na indisponibilidade da API. A pesquisa não localizou API pública documentada adequada à integração; isso não comprova inexistência de acesso restrito. A equipe informou em 23/10/2026 que o professor aceita a conferência manual e solicitou sua formalização. Esta revisão incorpora esse aceite ao RF-04, UC-02 e RN-02; o registro é baseado na informação da equipe, sem fabricar assinatura, ata ou comprovação externa.</w:t>
+        <w:t xml:space="preserve">O roteiro define a Sprint 2 entre 21/09 e 26/10/2026. A ERS original previa CREF automático nesta Sprint e admitia alternativa manual na indisponibilidade da API. A pesquisa não localizou API pública documentada adequada à integração; isso não comprova inexistência de acesso restrito. A equipe definiu a conferência manual como procedimento vigente, incorporado ao RF-04, UC-02 e RN-02. A alteração está consolidada nesta versão.</w:t>
       </w:r>
     </w:p>
     <w:p>
@@ -9969,7 +10149,7 @@
           <w:b w:val="false"/>
           <w:bCs w:val="false"/>
         </w:rPr>
-        <w:t xml:space="preserve">. O aceite de CREF manual não resolve esses assuntos nem comprova aceitação integral de cada requisito original.</w:t>
+        <w:t xml:space="preserve">. As diferenças entre escopo atual, implementação, homologação e evolução permanecem explícitas, sem atribuir conclusão a funções ainda não executadas.</w:t>
       </w:r>
     </w:p>
     <w:p>

</xml_diff>

<commit_message>
corrige e consolida a ers da sprint 2 no template original
</commit_message>
<xml_diff>
--- a/docs/evolucao/ERS-v2.docx
+++ b/docs/evolucao/ERS-v2.docx
@@ -12,7 +12,7 @@
           <w:b w:val="false"/>
           <w:bCs w:val="false"/>
         </w:rPr>
-        <w:t xml:space="preserve">ERS v2.3 — LinkAtletas — ampliação da Sprint 2</w:t>
+        <w:t xml:space="preserve">ERS v2.4 — LinkAtletas — ampliação da Sprint 2</w:t>
       </w:r>
     </w:p>
     <w:p>
@@ -30,7 +30,7 @@
           <w:b w:val="false"/>
           <w:bCs w:val="false"/>
         </w:rPr>
-        <w:t xml:space="preserve">Data da revisão: 23/10/2026. Responsável pela revisão: Lucca Castilho Costa, com autoria Git </w:t>
+        <w:t xml:space="preserve">Data da revisão: 24/10/2026. Responsável pela revisão: Lucca Castilho Costa, com autoria Git </w:t>
       </w:r>
       <w:r>
         <w:rPr>
@@ -1029,6 +1029,140 @@
           </w:p>
         </w:tc>
       </w:tr>
+      <w:tr>
+        <w:trPr>
+          <w:cantSplit/>
+          <w:tblHeader w:val="off"/>
+        </w:trPr>
+        <w:tc>
+          <w:tcPr>
+            <w:tcW w:type="dxa" w:w="1300"/>
+            <w:tcBorders>
+              <w:top w:val="single" w:color="D2DCD6" w:sz="1"/>
+              <w:left w:val="single" w:color="D2DCD6" w:sz="1"/>
+              <w:bottom w:val="single" w:color="D2DCD6" w:sz="1"/>
+              <w:right w:val="single" w:color="D2DCD6" w:sz="1"/>
+            </w:tcBorders>
+            <w:shd w:fill="FFFFFF" w:val="clear"/>
+            <w:tcMar>
+              <w:top w:type="dxa" w:w="80"/>
+              <w:left w:type="dxa" w:w="100"/>
+              <w:bottom w:type="dxa" w:w="80"/>
+              <w:right w:type="dxa" w:w="100"/>
+            </w:tcMar>
+          </w:tcPr>
+          <w:p>
+            <w:pPr>
+              <w:spacing w:after="40"/>
+            </w:pPr>
+            <w:r>
+              <w:rPr>
+                <w:b w:val="false"/>
+                <w:bCs w:val="false"/>
+                <w:sz w:val="17"/>
+                <w:szCs w:val="17"/>
+              </w:rPr>
+              <w:t xml:space="preserve">24/10/2026</w:t>
+            </w:r>
+          </w:p>
+        </w:tc>
+        <w:tc>
+          <w:tcPr>
+            <w:tcW w:type="dxa" w:w="700"/>
+            <w:tcBorders>
+              <w:top w:val="single" w:color="D2DCD6" w:sz="1"/>
+              <w:left w:val="single" w:color="D2DCD6" w:sz="1"/>
+              <w:bottom w:val="single" w:color="D2DCD6" w:sz="1"/>
+              <w:right w:val="single" w:color="D2DCD6" w:sz="1"/>
+            </w:tcBorders>
+            <w:shd w:fill="FFFFFF" w:val="clear"/>
+            <w:tcMar>
+              <w:top w:type="dxa" w:w="80"/>
+              <w:left w:type="dxa" w:w="100"/>
+              <w:bottom w:type="dxa" w:w="80"/>
+              <w:right w:type="dxa" w:w="100"/>
+            </w:tcMar>
+          </w:tcPr>
+          <w:p>
+            <w:pPr>
+              <w:spacing w:after="40"/>
+            </w:pPr>
+            <w:r>
+              <w:rPr>
+                <w:b w:val="false"/>
+                <w:bCs w:val="false"/>
+                <w:sz w:val="17"/>
+                <w:szCs w:val="17"/>
+              </w:rPr>
+              <w:t xml:space="preserve">2.4</w:t>
+            </w:r>
+          </w:p>
+        </w:tc>
+        <w:tc>
+          <w:tcPr>
+            <w:tcW w:type="dxa" w:w="5700"/>
+            <w:tcBorders>
+              <w:top w:val="single" w:color="D2DCD6" w:sz="1"/>
+              <w:left w:val="single" w:color="D2DCD6" w:sz="1"/>
+              <w:bottom w:val="single" w:color="D2DCD6" w:sz="1"/>
+              <w:right w:val="single" w:color="D2DCD6" w:sz="1"/>
+            </w:tcBorders>
+            <w:shd w:fill="FFFFFF" w:val="clear"/>
+            <w:tcMar>
+              <w:top w:type="dxa" w:w="80"/>
+              <w:left w:type="dxa" w:w="100"/>
+              <w:bottom w:type="dxa" w:w="80"/>
+              <w:right w:type="dxa" w:w="100"/>
+            </w:tcMar>
+          </w:tcPr>
+          <w:p>
+            <w:pPr>
+              <w:spacing w:after="40"/>
+            </w:pPr>
+            <w:r>
+              <w:rPr>
+                <w:b w:val="false"/>
+                <w:bCs w:val="false"/>
+                <w:sz w:val="17"/>
+                <w:szCs w:val="17"/>
+              </w:rPr>
+              <w:t xml:space="preserve">Aplicação da auditoria: requisitos integrados ao corpo, cenários e limites corrigidos, 16 casos de teste rastreáveis, figuras atuais, cronograma, sumário e retirada dos apêndices duplicados</w:t>
+            </w:r>
+          </w:p>
+        </w:tc>
+        <w:tc>
+          <w:tcPr>
+            <w:tcW w:type="dxa" w:w="1938"/>
+            <w:tcBorders>
+              <w:top w:val="single" w:color="D2DCD6" w:sz="1"/>
+              <w:left w:val="single" w:color="D2DCD6" w:sz="1"/>
+              <w:bottom w:val="single" w:color="D2DCD6" w:sz="1"/>
+              <w:right w:val="single" w:color="D2DCD6" w:sz="1"/>
+            </w:tcBorders>
+            <w:shd w:fill="FFFFFF" w:val="clear"/>
+            <w:tcMar>
+              <w:top w:type="dxa" w:w="80"/>
+              <w:left w:type="dxa" w:w="100"/>
+              <w:bottom w:type="dxa" w:w="80"/>
+              <w:right w:type="dxa" w:w="100"/>
+            </w:tcMar>
+          </w:tcPr>
+          <w:p>
+            <w:pPr>
+              <w:spacing w:after="40"/>
+            </w:pPr>
+            <w:r>
+              <w:rPr>
+                <w:b w:val="false"/>
+                <w:bCs w:val="false"/>
+                <w:sz w:val="17"/>
+                <w:szCs w:val="17"/>
+              </w:rPr>
+              <w:t xml:space="preserve">Lucca Castilho Costa</w:t>
+            </w:r>
+          </w:p>
+        </w:tc>
+      </w:tr>
     </w:tbl>
     <w:p>
       <w:pPr>
@@ -1063,7 +1197,7 @@
           <w:b w:val="false"/>
           <w:bCs w:val="false"/>
         </w:rPr>
-        <w:t xml:space="preserve">Cópia de apresentação para revisão: </w:t>
+        <w:t xml:space="preserve">Documento de apresentação: </w:t>
       </w:r>
       <w:r>
         <w:rPr>
@@ -1091,7 +1225,35 @@
           <w:b w:val="false"/>
           <w:bCs w:val="false"/>
         </w:rPr>
-        <w:t xml:space="preserve">. A fonte original da Sprint 1 permanece intacta.</w:t>
+        <w:t xml:space="preserve">, </w:t>
+      </w:r>
+      <w:r>
+        <w:rPr>
+          <w:b w:val="false"/>
+          <w:bCs w:val="false"/>
+        </w:rPr>
+        <w:t xml:space="preserve">texto das seções repaginadas (ERS-template-original.md)</w:t>
+      </w:r>
+      <w:r>
+        <w:rPr>
+          <w:b w:val="false"/>
+          <w:bCs w:val="false"/>
+        </w:rPr>
+        <w:t xml:space="preserve"> e </w:t>
+      </w:r>
+      <w:r>
+        <w:rPr>
+          <w:b w:val="false"/>
+          <w:bCs w:val="false"/>
+        </w:rPr>
+        <w:t xml:space="preserve">correções aplicadas (revisao-ers-aplicada-2026-10-24.md)</w:t>
+      </w:r>
+      <w:r>
+        <w:rPr>
+          <w:b w:val="false"/>
+          <w:bCs w:val="false"/>
+        </w:rPr>
+        <w:t xml:space="preserve">. A fonte original da Sprint 1 permanece intacta. O PDF integra o conteúdo nos capítulos 1–6, desenvolve a seção de testes e mantém o título 7 sem duplicar a especificação.</w:t>
       </w:r>
     </w:p>
     <w:p>
@@ -1257,7 +1419,7 @@
           <w:b w:val="false"/>
           <w:bCs w:val="false"/>
         </w:rPr>
-        <w:t xml:space="preserve">Prioridades: P0, essencial ao fluxo; P1, complemento do acompanhamento; P2, validação/evolução externa. </w:t>
+        <w:t xml:space="preserve">Prioridades: P0, essencial ao fluxo; P1, complemento do acompanhamento. Dependência externa e evolução são estados separados da prioridade. </w:t>
       </w:r>
       <w:r>
         <w:rPr>
@@ -1313,7 +1475,7 @@
           <w:b w:val="false"/>
           <w:bCs w:val="false"/>
         </w:rPr>
-        <w:t xml:space="preserve"> depende de serviço/dispositivo real, não de um checkbox de código.</w:t>
+        <w:t xml:space="preserve"> depende de serviço/dispositivo real, não de um checkbox de código. As especificações completas de cada RF estão na seção 2.1 do PDF e na fonte textual correspondente.</w:t>
       </w:r>
     </w:p>
     <w:p>
@@ -2022,7 +2184,7 @@
                 <w:sz w:val="17"/>
                 <w:szCs w:val="17"/>
               </w:rPr>
-              <w:t xml:space="preserve">Administrador consulta a fonte oficial e confere CREF, titularidade e situação profissional; registra decisão, motivo, evidência e validade com auditoria. Consulta automática não integra o aceite atual deste requisito; eventual integração é evolução futura</w:t>
+              <w:t xml:space="preserve">Administrador consulta a fonte oficial e confere CREF, titularidade e situação; registra fonte/data/resultado no motivo da decisão e prazo futuro opcional, com auditoria. A aprovação sem prazo explícito usa 365 dias de validade administrativa, sem atestar validade oficial da cédula. Não existe campo obrigatório separado para evidência da consulta; o campo evidence da submissão pertence ao treinador. Consulta automática é evolução futura</w:t>
             </w:r>
           </w:p>
         </w:tc>
@@ -2928,7 +3090,7 @@
                 <w:sz w:val="17"/>
                 <w:szCs w:val="17"/>
               </w:rPr>
-              <w:t xml:space="preserve">P1/P2</w:t>
+              <w:t xml:space="preserve">P1</w:t>
             </w:r>
           </w:p>
         </w:tc>
@@ -3062,7 +3224,7 @@
                 <w:sz w:val="17"/>
                 <w:szCs w:val="17"/>
               </w:rPr>
-              <w:t xml:space="preserve">P1/P2</w:t>
+              <w:t xml:space="preserve">P1</w:t>
             </w:r>
           </w:p>
         </w:tc>
@@ -4670,7 +4832,7 @@
                 <w:sz w:val="17"/>
                 <w:szCs w:val="17"/>
               </w:rPr>
-              <w:t xml:space="preserve">P1/P2</w:t>
+              <w:t xml:space="preserve">P1</w:t>
             </w:r>
           </w:p>
         </w:tc>
@@ -5650,7 +5812,7 @@
                 <w:sz w:val="17"/>
                 <w:szCs w:val="17"/>
               </w:rPr>
-              <w:t xml:space="preserve">P1/P2</w:t>
+              <w:t xml:space="preserve">P1</w:t>
             </w:r>
           </w:p>
         </w:tc>
@@ -6043,7 +6205,7 @@
           <w:b w:val="false"/>
           <w:bCs w:val="false"/>
         </w:rPr>
-        <w:t xml:space="preserve">Pré-condições: treinador autenticado com perfil completo; administrador autorizado para decidir. Fluxo principal: treinador informa CREF/evidência e pode anexar documento privado validado → submissão fica pendente → administrador consulta o portal oficial do conselho competente e compara registro, nome do titular e situação profissional → registra evidência da conferência, decisão, motivo e prazo → servidor persiste decisão/auditoria → perfil aprovado e elegível entra na descoberta. A consulta externa é uma atividade humana; o sistema não a executa nem atesta automaticamente a resposta do conselho.</w:t>
+        <w:t xml:space="preserve">Pré-condições: treinador autenticado com perfil completo; administrador autorizado para decidir. Fluxo principal: treinador informa CREF/evidência e pode anexar documento privado validado → submissão fica pendente → administrador consulta o portal oficial do conselho competente e compara registro, nome do titular e situação profissional → registra fonte, data e resultado no motivo da decisão e informa prazo futuro se necessário → servidor persiste decisão/auditoria → perfil aprovado e elegível entra na descoberta. Sem prazo explícito, a aprovação usa 365 dias como validade administrativa; não é validade oficial da cédula. A consulta externa é uma atividade humana; o sistema não a executa nem atesta automaticamente a resposta do conselho. Não há campo obrigatório separado de evidência administrativa: evidence da submissão é conteúdo enviado pelo treinador.</w:t>
       </w:r>
     </w:p>
     <w:p>
@@ -6815,7 +6977,7 @@
                 <w:sz w:val="20"/>
                 <w:szCs w:val="20"/>
               </w:rPr>
-              <w:t xml:space="preserve">Conferir registro/titular/situação na fonte oficial; decidir/suspender/expirar e verificar revisor, motivo, prazo e referência; decisão/auditoria transacionais</w:t>
+              <w:t xml:space="preserve">Conferir registro/titular/situação na fonte oficial; registrar fonte/data/resultado no motivo; decidir/suspender/expirar e verificar revisor, motivo, prazo e auditoria transacional</w:t>
             </w:r>
           </w:p>
         </w:tc>
@@ -6847,7 +7009,7 @@
                 <w:sz w:val="20"/>
                 <w:szCs w:val="20"/>
               </w:rPr>
-              <w:t xml:space="preserve">Testes locais comprovam o fluxo e a persistência, não consulta automática nem habilitação de dados fictícios; administrador direto do banco fora da garantia de imutabilidade</w:t>
+              <w:t xml:space="preserve">Evidência do treinador é distinta do motivo administrativo; testes locais comprovam fluxo/persistência, sem consulta automática ou habilitação de dados fictícios. Não há imutabilidade contra administrador direto do banco</w:t>
             </w:r>
           </w:p>
         </w:tc>
@@ -7153,7 +7315,7 @@
                 <w:sz w:val="20"/>
                 <w:szCs w:val="20"/>
               </w:rPr>
-              <w:t xml:space="preserve">Resultado somente após execução de carga, sem extrapolar base sintética</w:t>
+              <w:t xml:space="preserve">Carga local de 14/10: 500 treinadores sintéticos, 200 chamadas, concorrência 10, p95 97,78 ms; sem cache. Não extrapolar base sintética ou produção</w:t>
             </w:r>
           </w:p>
         </w:tc>
@@ -7293,7 +7455,7 @@
                 <w:sz w:val="20"/>
                 <w:szCs w:val="20"/>
               </w:rPr>
-              <w:t xml:space="preserve">RNF-08 Escala/70%</w:t>
+              <w:t xml:space="preserve">RNF-08 Escalabilidade</w:t>
             </w:r>
           </w:p>
         </w:tc>
@@ -7325,7 +7487,7 @@
                 <w:sz w:val="20"/>
                 <w:szCs w:val="20"/>
               </w:rPr>
-              <w:t xml:space="preserve">Testar expansão/balanceamento em nuvem e medir recursos</w:t>
+              <w:t xml:space="preserve">Na versão atual, executar carga no ambiente declarado e registrar latência/erros. Evolução: medir recursos e validar expansão/balanceamento na infraestrutura escolhida</w:t>
             </w:r>
           </w:p>
         </w:tc>
@@ -7357,7 +7519,7 @@
                 <w:sz w:val="20"/>
                 <w:szCs w:val="20"/>
               </w:rPr>
-              <w:t xml:space="preserve">Não homologado; Docker/TLS e carga local não provam autoescala</w:t>
+              <w:t xml:space="preserve">Meta original de autoescala em 70%, fila e balanceador permanece evolução, fora do aceite local atual; hospedagem em nuvem continua pendente e não equivale a autoescala</w:t>
             </w:r>
           </w:p>
         </w:tc>
@@ -7459,7 +7621,7 @@
                 <w:sz w:val="20"/>
                 <w:szCs w:val="20"/>
               </w:rPr>
-              <w:t xml:space="preserve">Capturas e verificações conforme relatório; bundle não equivale a execução em aparelho físico</w:t>
+              <w:t xml:space="preserve">Capturas conforme relatório; bundle não equivale a aparelho físico. Material/HIG, contraste do sistema e fontes ampliadas exigem verificação própria ainda não homologada</w:t>
             </w:r>
           </w:p>
         </w:tc>
@@ -7529,7 +7691,7 @@
                 <w:sz w:val="20"/>
                 <w:szCs w:val="20"/>
               </w:rPr>
-              <w:t xml:space="preserve">Prescrever/publicar, reabrir rascunho, teclado/foco; instruções e confirmações claras</w:t>
+              <w:t xml:space="preserve">Completar prescrição/publicação, salvar e reabrir rascunho com dados iguais; verificar teclado/foco, instruções e confirmação, sem bloqueio por erro tratado</w:t>
             </w:r>
           </w:p>
         </w:tc>
@@ -7561,7 +7723,7 @@
                 <w:sz w:val="20"/>
                 <w:szCs w:val="20"/>
               </w:rPr>
-              <w:t xml:space="preserve">Rascunho explícito; autosave contínuo ainda não implementado</w:t>
+              <w:t xml:space="preserve">Rascunho explícito testado; autosave contínuo futuro. Não se adota menor número de cliques sem medição como critério aprovado</w:t>
             </w:r>
           </w:p>
         </w:tc>
@@ -7631,7 +7793,7 @@
                 <w:sz w:val="20"/>
                 <w:szCs w:val="20"/>
               </w:rPr>
-              <w:t xml:space="preserve">Erro de rede/validação, estado de envio e sucesso após resposta positiva; sem falso pagamento</w:t>
+              <w:t xml:space="preserve">Verificar espera durante envio, tratamento de rede/validação e confirmação apenas após resposta positiva; evitar duplicidade e falso pagamento</w:t>
             </w:r>
           </w:p>
         </w:tc>
@@ -7663,7 +7825,7 @@
                 <w:sz w:val="20"/>
                 <w:szCs w:val="20"/>
               </w:rPr>
-              <w:t xml:space="preserve">E2E efetivo e capturas conforme relatório</w:t>
+              <w:t xml:space="preserve">Indicador de espera não significa porcentagem real de progresso. E2E e capturas têm o alcance registrado no relatório</w:t>
             </w:r>
           </w:p>
         </w:tc>
@@ -8039,7 +8201,7 @@
                 <w:sz w:val="20"/>
                 <w:szCs w:val="20"/>
               </w:rPr>
-              <w:t xml:space="preserve">Checkout concorrente, webhook repetido/antigo, timeout e cancelamento incerto; conciliar sem duplicar</w:t>
+              <w:t xml:space="preserve">Checkout concorrente, webhook repetido/antigo, timeout e cancelamento incerto; verificar locks/unicidade locais e conciliar sem repetir criação incerta</w:t>
             </w:r>
           </w:p>
         </w:tc>
@@ -8071,7 +8233,7 @@
                 <w:sz w:val="20"/>
                 <w:szCs w:val="20"/>
               </w:rPr>
-              <w:t xml:space="preserve">HTTP controlado; repetir em sandbox real antes da ativação</w:t>
+              <w:t xml:space="preserve">HTTP controlado; homologação do provedor pendente. O adaptador não envia chave de idempotência externa, portanto não garante deduplicação pelo gateway. Jobs exigem execução/agendamento operacional; não há garantia automática de rotina noturna</w:t>
             </w:r>
           </w:p>
         </w:tc>
@@ -8423,7 +8585,7 @@
                 <w:sz w:val="20"/>
                 <w:szCs w:val="20"/>
               </w:rPr>
-              <w:t xml:space="preserve">Administrador confere registro, titularidade e situação na fonte oficial; aprovação registra administrador, horário, origem manual, motivo/evidência, prazo e documento quando fornecido. Formato válido do número não substitui conferência profissional</w:t>
+              <w:t xml:space="preserve">Administrador confere registro, titularidade e situação na fonte oficial e inclui fonte/data/resultado no motivo. Decisão e auditoria registram revisor, horário, origem manual e prazo: futuro explícito ou 365 dias administrativos por padrão na aprovação. Documento do treinador é opcional; evidence da submissão não é campo separado da conferência administrativa. Formato do número não comprova habilitação</w:t>
             </w:r>
           </w:p>
         </w:tc>
@@ -10022,7 +10184,7 @@
         </w:rPr>
         <w:t xml:space="preserve"> do repositório do grupo; a revisão técnica foi integrada pelo </w:t>
       </w:r>
-      <w:hyperlink w:history="1" r:id="rIdkowscejrcutugvd6_bwek">
+      <w:hyperlink w:history="1" r:id="rIdznvvqsi8u75enusrooe-k">
         <w:r>
           <w:rPr>
             <w:rStyle w:val="Hyperlink"/>
@@ -10049,7 +10211,7 @@
           <w:b w:val="false"/>
           <w:bCs w:val="false"/>
         </w:rPr>
-        <w:t xml:space="preserve">. Esta revisão é documental; não representa nova execução desses testes em 23/10/2026.</w:t>
+        <w:t xml:space="preserve">. Esta revisão é documental; não representa nova execução desses testes em 24/10/2026. A seção 6 do PDF desenvolve CT001–CT016 com pré-condições, passos, esperado, observado, data/ambiente e evidência rastreável.</w:t>
       </w:r>
     </w:p>
     <w:p>
@@ -10286,7 +10448,7 @@
         <w:sz w:val="17"/>
         <w:szCs w:val="17"/>
       </w:rPr>
-      <w:t xml:space="preserve">LinkAtletas - 23/10/2026     </w:t>
+      <w:t xml:space="preserve">LinkAtletas - 24/10/2026     </w:t>
     </w:r>
     <w:r>
       <w:rPr>

</xml_diff>

<commit_message>
ajusta a estrutura da ers e refaz o word completo
</commit_message>
<xml_diff>
--- a/docs/evolucao/ERS-v2.docx
+++ b/docs/evolucao/ERS-v2.docx
@@ -12,7 +12,7 @@
           <w:b w:val="false"/>
           <w:bCs w:val="false"/>
         </w:rPr>
-        <w:t xml:space="preserve">ERS v2.4 — LinkAtletas — ampliação da Sprint 2</w:t>
+        <w:t xml:space="preserve">ERS v2.5 — LinkAtletas — ampliação da Sprint 2</w:t>
       </w:r>
     </w:p>
     <w:p>
@@ -1163,6 +1163,140 @@
           </w:p>
         </w:tc>
       </w:tr>
+      <w:tr>
+        <w:trPr>
+          <w:cantSplit/>
+          <w:tblHeader w:val="off"/>
+        </w:trPr>
+        <w:tc>
+          <w:tcPr>
+            <w:tcW w:type="dxa" w:w="1300"/>
+            <w:tcBorders>
+              <w:top w:val="single" w:color="D2DCD6" w:sz="1"/>
+              <w:left w:val="single" w:color="D2DCD6" w:sz="1"/>
+              <w:bottom w:val="single" w:color="D2DCD6" w:sz="1"/>
+              <w:right w:val="single" w:color="D2DCD6" w:sz="1"/>
+            </w:tcBorders>
+            <w:shd w:fill="FFFFFF" w:val="clear"/>
+            <w:tcMar>
+              <w:top w:type="dxa" w:w="80"/>
+              <w:left w:type="dxa" w:w="100"/>
+              <w:bottom w:type="dxa" w:w="80"/>
+              <w:right w:type="dxa" w:w="100"/>
+            </w:tcMar>
+          </w:tcPr>
+          <w:p>
+            <w:pPr>
+              <w:spacing w:after="40"/>
+            </w:pPr>
+            <w:r>
+              <w:rPr>
+                <w:b w:val="false"/>
+                <w:bCs w:val="false"/>
+                <w:sz w:val="17"/>
+                <w:szCs w:val="17"/>
+              </w:rPr>
+              <w:t xml:space="preserve">24/10/2026</w:t>
+            </w:r>
+          </w:p>
+        </w:tc>
+        <w:tc>
+          <w:tcPr>
+            <w:tcW w:type="dxa" w:w="700"/>
+            <w:tcBorders>
+              <w:top w:val="single" w:color="D2DCD6" w:sz="1"/>
+              <w:left w:val="single" w:color="D2DCD6" w:sz="1"/>
+              <w:bottom w:val="single" w:color="D2DCD6" w:sz="1"/>
+              <w:right w:val="single" w:color="D2DCD6" w:sz="1"/>
+            </w:tcBorders>
+            <w:shd w:fill="FFFFFF" w:val="clear"/>
+            <w:tcMar>
+              <w:top w:type="dxa" w:w="80"/>
+              <w:left w:type="dxa" w:w="100"/>
+              <w:bottom w:type="dxa" w:w="80"/>
+              <w:right w:type="dxa" w:w="100"/>
+            </w:tcMar>
+          </w:tcPr>
+          <w:p>
+            <w:pPr>
+              <w:spacing w:after="40"/>
+            </w:pPr>
+            <w:r>
+              <w:rPr>
+                <w:b w:val="false"/>
+                <w:bCs w:val="false"/>
+                <w:sz w:val="17"/>
+                <w:szCs w:val="17"/>
+              </w:rPr>
+              <w:t xml:space="preserve">2.5</w:t>
+            </w:r>
+          </w:p>
+        </w:tc>
+        <w:tc>
+          <w:tcPr>
+            <w:tcW w:type="dxa" w:w="5700"/>
+            <w:tcBorders>
+              <w:top w:val="single" w:color="D2DCD6" w:sz="1"/>
+              <w:left w:val="single" w:color="D2DCD6" w:sz="1"/>
+              <w:bottom w:val="single" w:color="D2DCD6" w:sz="1"/>
+              <w:right w:val="single" w:color="D2DCD6" w:sz="1"/>
+            </w:tcBorders>
+            <w:shd w:fill="FFFFFF" w:val="clear"/>
+            <w:tcMar>
+              <w:top w:type="dxa" w:w="80"/>
+              <w:left w:type="dxa" w:w="100"/>
+              <w:bottom w:type="dxa" w:w="80"/>
+              <w:right w:type="dxa" w:w="100"/>
+            </w:tcMar>
+          </w:tcPr>
+          <w:p>
+            <w:pPr>
+              <w:spacing w:after="40"/>
+            </w:pPr>
+            <w:r>
+              <w:rPr>
+                <w:b w:val="false"/>
+                <w:bCs w:val="false"/>
+                <w:sz w:val="17"/>
+                <w:szCs w:val="17"/>
+              </w:rPr>
+              <w:t xml:space="preserve">Retirada do detalhamento 5.4.1 acrescentado e da lista final de relatórios, espaçamento dos CTs e apêndices, reconstrução do Word completo com layout posicionado e texto editável</w:t>
+            </w:r>
+          </w:p>
+        </w:tc>
+        <w:tc>
+          <w:tcPr>
+            <w:tcW w:type="dxa" w:w="1938"/>
+            <w:tcBorders>
+              <w:top w:val="single" w:color="D2DCD6" w:sz="1"/>
+              <w:left w:val="single" w:color="D2DCD6" w:sz="1"/>
+              <w:bottom w:val="single" w:color="D2DCD6" w:sz="1"/>
+              <w:right w:val="single" w:color="D2DCD6" w:sz="1"/>
+            </w:tcBorders>
+            <w:shd w:fill="FFFFFF" w:val="clear"/>
+            <w:tcMar>
+              <w:top w:type="dxa" w:w="80"/>
+              <w:left w:type="dxa" w:w="100"/>
+              <w:bottom w:type="dxa" w:w="80"/>
+              <w:right w:type="dxa" w:w="100"/>
+            </w:tcMar>
+          </w:tcPr>
+          <w:p>
+            <w:pPr>
+              <w:spacing w:after="40"/>
+            </w:pPr>
+            <w:r>
+              <w:rPr>
+                <w:b w:val="false"/>
+                <w:bCs w:val="false"/>
+                <w:sz w:val="17"/>
+                <w:szCs w:val="17"/>
+              </w:rPr>
+              <w:t xml:space="preserve">Lucca Castilho Costa</w:t>
+            </w:r>
+          </w:p>
+        </w:tc>
+      </w:tr>
     </w:tbl>
     <w:p>
       <w:pPr>
@@ -1211,6 +1345,20 @@
           <w:b w:val="false"/>
           <w:bCs w:val="false"/>
         </w:rPr>
+        <w:t xml:space="preserve"> e </w:t>
+      </w:r>
+      <w:r>
+        <w:rPr>
+          <w:b w:val="false"/>
+          <w:bCs w:val="false"/>
+        </w:rPr>
+        <w:t xml:space="preserve">Word completo editável v2.5 (ERS-completa-v2.5-editavel.docx)</w:t>
+      </w:r>
+      <w:r>
+        <w:rPr>
+          <w:b w:val="false"/>
+          <w:bCs w:val="false"/>
+        </w:rPr>
         <w:t xml:space="preserve">, com </w:t>
       </w:r>
       <w:r>
@@ -1246,14 +1394,14 @@
           <w:b w:val="false"/>
           <w:bCs w:val="false"/>
         </w:rPr>
-        <w:t xml:space="preserve">correções aplicadas (revisao-ers-aplicada-2026-10-24.md)</w:t>
-      </w:r>
-      <w:r>
-        <w:rPr>
-          <w:b w:val="false"/>
-          <w:bCs w:val="false"/>
-        </w:rPr>
-        <w:t xml:space="preserve">. A fonte original da Sprint 1 permanece intacta. O PDF integra o conteúdo nos capítulos 1–6, desenvolve a seção de testes e mantém o título 7 sem duplicar a especificação.</w:t>
+        <w:t xml:space="preserve">ajustes de estrutura e Word (ajustes-ers-v2.5.md)</w:t>
+      </w:r>
+      <w:r>
+        <w:rPr>
+          <w:b w:val="false"/>
+          <w:bCs w:val="false"/>
+        </w:rPr>
+        <w:t xml:space="preserve">. A fonte original da Sprint 1 permanece intacta. O PDF integra o conteúdo nos capítulos 1–6, desenvolve a seção de testes e mantém o título 7 sem duplicar a especificação. Este Markdown e o arquivo ERS-v2.docx são sínteses auxiliares; o Word completo é o arquivo v2.5 identificado acima.</w:t>
       </w:r>
     </w:p>
     <w:p>
@@ -10184,7 +10332,7 @@
         </w:rPr>
         <w:t xml:space="preserve"> do repositório do grupo; a revisão técnica foi integrada pelo </w:t>
       </w:r>
-      <w:hyperlink w:history="1" r:id="rIdznvvqsi8u75enusrooe-k">
+      <w:hyperlink w:history="1" r:id="rIdm6lst-rwgc0uyyx6nayle">
         <w:r>
           <w:rPr>
             <w:rStyle w:val="Hyperlink"/>

</xml_diff>